<commit_message>
Projet de recherche : noms du binôme et du tuteur, liens DOI cliquables
Co-Authored-By: Claude Opus 5.5 <noreply@anthropic.com>
Claude-Session: https://claude.ai/code/session_014nDgLta1jkqmWhdFtwnAQa
</commit_message>
<xml_diff>
--- a/memoire/Projet_de_recherche_Jalon2.docx
+++ b/memoire/Projet_de_recherche_Jalon2.docx
@@ -76,7 +76,7 @@
         <w:t xml:space="preserve">Auteurs (binôme) : </w:t>
       </w:r>
       <w:r>
-        <w:t xml:space="preserve">Clément Fessmann et Dimitri [Nom]</w:t>
+        <w:t xml:space="preserve">Clément Fessmann et Dimitri Raptotassios</w:t>
       </w:r>
     </w:p>
     <w:p>
@@ -92,7 +92,7 @@
         <w:t xml:space="preserve">Superviseur : </w:t>
       </w:r>
       <w:r>
-        <w:t xml:space="preserve">[Prénom Nom du tuteur]</w:t>
+        <w:t xml:space="preserve">Jesus Del Rio</w:t>
       </w:r>
     </w:p>
     <w:p>
@@ -1151,7 +1151,7 @@
         <w:jc w:val="both"/>
       </w:pPr>
       <w:r>
-        <w:t xml:space="preserve">L’accès au terrain barcelonais s’appuiera sur le réseau constitué par Dimitri [Nom] lors de son stage à Barcelone ; le terrain marseillais, sur les conciergeries et les associations professionnelles locales. L’anonymat sera garanti à tous les répondants.</w:t>
+        <w:t xml:space="preserve">L’accès au terrain barcelonais s’appuiera sur le réseau constitué par Dimitri Raptotassios lors de son stage à Barcelone ; le terrain marseillais, sur les conciergeries et les associations professionnelles locales. L’anonymat sera garanti à tous les répondants.</w:t>
       </w:r>
     </w:p>
     <w:p>
@@ -1255,7 +1255,7 @@
         <w:jc w:val="both"/>
       </w:pPr>
       <w:r>
-        <w:t xml:space="preserve">Chaque membre du binôme pilotera la collecte sur une ville (Dimitri [Nom] à Barcelone, Clément Fessmann à Marseille). La revue de littérature, le codage et l’analyse croisée seront conduits conjointement, afin de garantir une contribution équivalente des deux auteurs.</w:t>
+        <w:t xml:space="preserve">Chaque membre du binôme pilotera la collecte sur une ville (Dimitri Raptotassios à Barcelone, Clément Fessmann à Marseille). La revue de littérature, le codage et l’analyse croisée seront conduits conjointement, afin de garantir une contribution équivalente des deux auteurs.</w:t>
       </w:r>
     </w:p>
     <w:p>
@@ -1957,6 +1957,17 @@
       <w:r>
         <w:t xml:space="preserve">(1), 23–47.</w:t>
       </w:r>
+      <w:r>
+        <w:t xml:space="preserve"> </w:t>
+      </w:r>
+      <w:hyperlink w:history="1" r:id="rId-9xuafvowt5skifl0ewtr">
+        <w:r>
+          <w:rPr>
+            <w:rStyle w:val="Hyperlink"/>
+          </w:rPr>
+          <w:t xml:space="preserve">https://doi.org/10.1287/mksc.2020.1227</w:t>
+        </w:r>
+      </w:hyperlink>
     </w:p>
     <w:p>
       <w:pPr>
@@ -1977,6 +1988,17 @@
       <w:r>
         <w:t xml:space="preserve">(2), 77–101.</w:t>
       </w:r>
+      <w:r>
+        <w:t xml:space="preserve"> </w:t>
+      </w:r>
+      <w:hyperlink w:history="1" r:id="rIdiuffk0iflnpcqt5pclkoc">
+        <w:r>
+          <w:rPr>
+            <w:rStyle w:val="Hyperlink"/>
+          </w:rPr>
+          <w:t xml:space="preserve">https://doi.org/10.1191/1478088706qp063oa</w:t>
+        </w:r>
+      </w:hyperlink>
     </w:p>
     <w:p>
       <w:pPr>
@@ -1997,6 +2019,17 @@
       <w:r>
         <w:t xml:space="preserve">(4), 532–550.</w:t>
       </w:r>
+      <w:r>
+        <w:t xml:space="preserve"> </w:t>
+      </w:r>
+      <w:hyperlink w:history="1" r:id="rIdadalsprs30awmrovlsqhn">
+        <w:r>
+          <w:rPr>
+            <w:rStyle w:val="Hyperlink"/>
+          </w:rPr>
+          <w:t xml:space="preserve">https://doi.org/10.5465/amr.1989.4308385</w:t>
+        </w:r>
+      </w:hyperlink>
     </w:p>
     <w:p>
       <w:pPr>
@@ -2017,6 +2050,17 @@
       <w:r>
         <w:t xml:space="preserve">(1), 200–227.</w:t>
       </w:r>
+      <w:r>
+        <w:t xml:space="preserve"> </w:t>
+      </w:r>
+      <w:hyperlink w:history="1" r:id="rId7ha8krj_8v54mjq2m98gt">
+        <w:r>
+          <w:rPr>
+            <w:rStyle w:val="Hyperlink"/>
+          </w:rPr>
+          <w:t xml:space="preserve">https://doi.org/10.1177/0149206316675927</w:t>
+        </w:r>
+      </w:hyperlink>
     </w:p>
     <w:p>
       <w:pPr>
@@ -2037,6 +2081,17 @@
       <w:r>
         <w:t xml:space="preserve">, 103278.</w:t>
       </w:r>
+      <w:r>
+        <w:t xml:space="preserve"> </w:t>
+      </w:r>
+      <w:hyperlink w:history="1" r:id="rIdwptpjzgseplmgkuox7oj4">
+        <w:r>
+          <w:rPr>
+            <w:rStyle w:val="Hyperlink"/>
+          </w:rPr>
+          <w:t xml:space="preserve">https://doi.org/10.1016/j.jue.2020.103278</w:t>
+        </w:r>
+      </w:hyperlink>
     </w:p>
     <w:p>
       <w:pPr>
@@ -2057,6 +2112,17 @@
       <w:r>
         <w:t xml:space="preserve">(1), 15–31.</w:t>
       </w:r>
+      <w:r>
+        <w:t xml:space="preserve"> </w:t>
+      </w:r>
+      <w:hyperlink w:history="1" r:id="rIdhw7obwzeuoqywd4mwwxhc">
+        <w:r>
+          <w:rPr>
+            <w:rStyle w:val="Hyperlink"/>
+          </w:rPr>
+          <w:t xml:space="preserve">https://doi.org/10.1177/1094428112452151</w:t>
+        </w:r>
+      </w:hyperlink>
     </w:p>
     <w:p>
       <w:pPr>
@@ -2077,6 +2143,17 @@
       <w:r>
         <w:t xml:space="preserve">(1), 80–92.</w:t>
       </w:r>
+      <w:r>
+        <w:t xml:space="preserve"> </w:t>
+      </w:r>
+      <w:hyperlink w:history="1" r:id="rIdnxjlpgqqeitlysevqu7s1">
+        <w:r>
+          <w:rPr>
+            <w:rStyle w:val="Hyperlink"/>
+          </w:rPr>
+          <w:t xml:space="preserve">https://doi.org/10.1080/01944363.2016.1249011</w:t>
+        </w:r>
+      </w:hyperlink>
     </w:p>
     <w:p>
       <w:pPr>
@@ -2097,6 +2174,17 @@
       <w:r>
         <w:t xml:space="preserve">(12), 1192–1217.</w:t>
       </w:r>
+      <w:r>
+        <w:t xml:space="preserve"> </w:t>
+      </w:r>
+      <w:hyperlink w:history="1" r:id="rId5mzdjtsprj5czo_dybmhw">
+        <w:r>
+          <w:rPr>
+            <w:rStyle w:val="Hyperlink"/>
+          </w:rPr>
+          <w:t xml:space="preserve">https://doi.org/10.1080/13683500.2013.827159</w:t>
+        </w:r>
+      </w:hyperlink>
     </w:p>
     <w:p>
       <w:pPr>
@@ -2117,6 +2205,17 @@
       <w:r>
         <w:t xml:space="preserve">(7), 811–825.</w:t>
       </w:r>
+      <w:r>
+        <w:t xml:space="preserve"> </w:t>
+      </w:r>
+      <w:hyperlink w:history="1" r:id="rIdbkqjtnjtqxjwnd7gnjidr">
+        <w:r>
+          <w:rPr>
+            <w:rStyle w:val="Hyperlink"/>
+          </w:rPr>
+          <w:t xml:space="preserve">https://doi.org/10.1080/13683500.2018.1504899</w:t>
+        </w:r>
+      </w:hyperlink>
     </w:p>
     <w:p>
       <w:pPr>
@@ -2137,6 +2236,17 @@
       <w:r>
         <w:t xml:space="preserve">(1), 145–179.</w:t>
       </w:r>
+      <w:r>
+        <w:t xml:space="preserve"> </w:t>
+      </w:r>
+      <w:hyperlink w:history="1" r:id="rIdkf2cmcnraqaptvcnw0oxf">
+        <w:r>
+          <w:rPr>
+            <w:rStyle w:val="Hyperlink"/>
+          </w:rPr>
+          <w:t xml:space="preserve">https://doi.org/10.5465/amr.1991.4279002</w:t>
+        </w:r>
+      </w:hyperlink>
     </w:p>
     <w:p>
       <w:pPr>
@@ -2157,6 +2267,17 @@
       <w:r>
         <w:t xml:space="preserve">(5), 567–581.</w:t>
       </w:r>
+      <w:r>
+        <w:t xml:space="preserve"> </w:t>
+      </w:r>
+      <w:hyperlink w:history="1" r:id="rIdrsdxbnibcddzf4oorckuu">
+        <w:r>
+          <w:rPr>
+            <w:rStyle w:val="Hyperlink"/>
+          </w:rPr>
+          <w:t xml:space="preserve">https://doi.org/10.1016/j.lrp.2016.06.006</w:t>
+        </w:r>
+      </w:hyperlink>
     </w:p>
     <w:p>
       <w:pPr>
@@ -2177,6 +2298,17 @@
       <w:r>
         <w:t xml:space="preserve">(2–3), 172–194.</w:t>
       </w:r>
+      <w:r>
+        <w:t xml:space="preserve"> </w:t>
+      </w:r>
+      <w:hyperlink w:history="1" r:id="rId1fcezsq3_lt4pgr5jplwd">
+        <w:r>
+          <w:rPr>
+            <w:rStyle w:val="Hyperlink"/>
+          </w:rPr>
+          <w:t xml:space="preserve">https://doi.org/10.1016/j.lrp.2009.07.003</w:t>
+        </w:r>
+      </w:hyperlink>
     </w:p>
     <w:p>
       <w:pPr>
@@ -2197,6 +2329,17 @@
       <w:r>
         <w:t xml:space="preserve">(3), 248–272.</w:t>
       </w:r>
+      <w:r>
+        <w:t xml:space="preserve"> </w:t>
+      </w:r>
+      <w:hyperlink w:history="1" r:id="rIdtc2b9ablrrefy_zjdvmmc">
+        <w:r>
+          <w:rPr>
+            <w:rStyle w:val="Hyperlink"/>
+          </w:rPr>
+          <w:t xml:space="preserve">https://doi.org/10.5465/amd.2016.0153</w:t>
+        </w:r>
+      </w:hyperlink>
     </w:p>
     <w:p>
       <w:pPr>
@@ -2217,6 +2360,17 @@
       <w:r>
         <w:t xml:space="preserve">(6), 1147–1170.</w:t>
       </w:r>
+      <w:r>
+        <w:t xml:space="preserve"> </w:t>
+      </w:r>
+      <w:hyperlink w:history="1" r:id="rIdhdyiojzfebyzusrps8-kr">
+        <w:r>
+          <w:rPr>
+            <w:rStyle w:val="Hyperlink"/>
+          </w:rPr>
+          <w:t xml:space="preserve">https://doi.org/10.1177/0308518X18778038</w:t>
+        </w:r>
+      </w:hyperlink>
     </w:p>
     <w:p>
       <w:pPr>
@@ -2237,6 +2391,17 @@
       <w:r>
         <w:t xml:space="preserve">(5), 687–705.</w:t>
       </w:r>
+      <w:r>
+        <w:t xml:space="preserve"> </w:t>
+      </w:r>
+      <w:hyperlink w:history="1" r:id="rIdyaswokgmlzz0bxdd8ct0f">
+        <w:r>
+          <w:rPr>
+            <w:rStyle w:val="Hyperlink"/>
+          </w:rPr>
+          <w:t xml:space="preserve">https://doi.org/10.1509/jmr.15.0204</w:t>
+        </w:r>
+      </w:hyperlink>
     </w:p>
     <w:p>
       <w:pPr>
@@ -2257,6 +2422,17 @@
       <w:r>
         <w:t xml:space="preserve">(4), 1019–1042.</w:t>
       </w:r>
+      <w:r>
+        <w:t xml:space="preserve"> </w:t>
+      </w:r>
+      <w:hyperlink w:history="1" r:id="rIdriyckgt34ipk4_luj5dsx">
+        <w:r>
+          <w:rPr>
+            <w:rStyle w:val="Hyperlink"/>
+          </w:rPr>
+          <w:t xml:space="preserve">https://doi.org/10.1177/0149206311406265</w:t>
+        </w:r>
+      </w:hyperlink>
     </w:p>
     <w:p>
       <w:pPr>
@@ -2290,6 +2466,17 @@
       <w:r>
         <w:t xml:space="preserve">.</w:t>
       </w:r>
+      <w:r>
+        <w:t xml:space="preserve"> </w:t>
+      </w:r>
+      <w:hyperlink w:history="1" r:id="rIdow-jljjiaqwcl6e7dsvtj">
+        <w:r>
+          <w:rPr>
+            <w:rStyle w:val="Hyperlink"/>
+          </w:rPr>
+          <w:t xml:space="preserve">https://www.legifrance.gouv.fr/eli/loi/2024/11/19/TECX2330139L/jo/texte</w:t>
+        </w:r>
+      </w:hyperlink>
     </w:p>
     <w:p>
       <w:pPr>
@@ -2310,6 +2497,17 @@
       <w:r>
         <w:t xml:space="preserve">.</w:t>
       </w:r>
+      <w:r>
+        <w:t xml:space="preserve"> </w:t>
+      </w:r>
+      <w:hyperlink w:history="1" r:id="rIdb8np1ixw0vbv37jvxp60j">
+        <w:r>
+          <w:rPr>
+            <w:rStyle w:val="Hyperlink"/>
+          </w:rPr>
+          <w:t xml:space="preserve">https://eur-lex.europa.eu/eli/reg/2024/1028/oj</w:t>
+        </w:r>
+      </w:hyperlink>
     </w:p>
     <w:sectPr>
       <w:footerReference w:type="default" r:id="rId7"/>
@@ -2375,7 +2573,7 @@
         <w:sz w:val="18"/>
         <w:szCs w:val="18"/>
       </w:rPr>
-      <w:t xml:space="preserve">Projet de recherche – Fessmann &amp; [Nom] – KEDGE PGE 2026/2027 – page </w:t>
+      <w:t xml:space="preserve">Projet de recherche – Fessmann &amp; Raptotassios – KEDGE PGE 2026/2027 – page </w:t>
     </w:r>
     <w:r>
       <w:rPr>

</xml_diff>

<commit_message>
Projet de recherche : travail conjoint du binôme sur les deux terrains
Co-Authored-By: Claude Opus 5.5 <noreply@anthropic.com>
Claude-Session: https://claude.ai/code/session_014nDgLta1jkqmWhdFtwnAQa
</commit_message>
<xml_diff>
--- a/memoire/Projet_de_recherche_Jalon2.docx
+++ b/memoire/Projet_de_recherche_Jalon2.docx
@@ -1151,7 +1151,7 @@
         <w:jc w:val="both"/>
       </w:pPr>
       <w:r>
-        <w:t xml:space="preserve">L’accès au terrain barcelonais s’appuiera sur le réseau constitué par Dimitri Raptotassios lors de son stage à Barcelone ; le terrain marseillais, sur les conciergeries et les associations professionnelles locales. L’anonymat sera garanti à tous les répondants.</w:t>
+        <w:t xml:space="preserve">L’accès au terrain s’appuiera, à Barcelone, sur le réseau professionnel constitué lors d’un stage effectué sur place par l’un des auteurs et, à Marseille, sur les conciergeries et les associations professionnelles locales. L’anonymat sera garanti à tous les répondants.</w:t>
       </w:r>
     </w:p>
     <w:p>
@@ -1255,7 +1255,7 @@
         <w:jc w:val="both"/>
       </w:pPr>
       <w:r>
-        <w:t xml:space="preserve">Chaque membre du binôme pilotera la collecte sur une ville (Dimitri Raptotassios à Barcelone, Clément Fessmann à Marseille). La revue de littérature, le codage et l’analyse croisée seront conduits conjointement, afin de garantir une contribution équivalente des deux auteurs.</w:t>
+        <w:t xml:space="preserve">Les deux auteurs travailleront conjointement sur les deux terrains. Chaque entretien sera, dans la mesure du possible, conduit en binôme : l’un mène l’échange, l’autre prend des notes et relance. Cette organisation garantit une connaissance égale des deux cas par chacun des auteurs, condition d’une analyse comparée rigoureuse. La revue de littérature, le codage et l’interprétation des résultats seront également menés à quatre mains, ce qui permettra de confronter les lectures et de limiter les biais d’interprétation propres à un chercheur isolé. Cette répartition assure une contribution équivalente des deux auteurs.</w:t>
       </w:r>
     </w:p>
     <w:p>
@@ -1960,7 +1960,7 @@
       <w:r>
         <w:t xml:space="preserve"> </w:t>
       </w:r>
-      <w:hyperlink w:history="1" r:id="rId-9xuafvowt5skifl0ewtr">
+      <w:hyperlink w:history="1" r:id="rIdg3xklxm0ov_v2lkpqotid">
         <w:r>
           <w:rPr>
             <w:rStyle w:val="Hyperlink"/>
@@ -1991,7 +1991,7 @@
       <w:r>
         <w:t xml:space="preserve"> </w:t>
       </w:r>
-      <w:hyperlink w:history="1" r:id="rIdiuffk0iflnpcqt5pclkoc">
+      <w:hyperlink w:history="1" r:id="rId2ggdu6syis3imtgd_0kob">
         <w:r>
           <w:rPr>
             <w:rStyle w:val="Hyperlink"/>
@@ -2022,7 +2022,7 @@
       <w:r>
         <w:t xml:space="preserve"> </w:t>
       </w:r>
-      <w:hyperlink w:history="1" r:id="rIdadalsprs30awmrovlsqhn">
+      <w:hyperlink w:history="1" r:id="rIddol2dv54usggeodn0xxqc">
         <w:r>
           <w:rPr>
             <w:rStyle w:val="Hyperlink"/>
@@ -2053,7 +2053,7 @@
       <w:r>
         <w:t xml:space="preserve"> </w:t>
       </w:r>
-      <w:hyperlink w:history="1" r:id="rId7ha8krj_8v54mjq2m98gt">
+      <w:hyperlink w:history="1" r:id="rIdoozr-wpgkrysmxognpfja">
         <w:r>
           <w:rPr>
             <w:rStyle w:val="Hyperlink"/>
@@ -2084,7 +2084,7 @@
       <w:r>
         <w:t xml:space="preserve"> </w:t>
       </w:r>
-      <w:hyperlink w:history="1" r:id="rIdwptpjzgseplmgkuox7oj4">
+      <w:hyperlink w:history="1" r:id="rIdw9dulu1lgzqrq9vi8jt8y">
         <w:r>
           <w:rPr>
             <w:rStyle w:val="Hyperlink"/>
@@ -2115,7 +2115,7 @@
       <w:r>
         <w:t xml:space="preserve"> </w:t>
       </w:r>
-      <w:hyperlink w:history="1" r:id="rIdhw7obwzeuoqywd4mwwxhc">
+      <w:hyperlink w:history="1" r:id="rIdmoteklrjvbgyuzpan2fnx">
         <w:r>
           <w:rPr>
             <w:rStyle w:val="Hyperlink"/>
@@ -2146,7 +2146,7 @@
       <w:r>
         <w:t xml:space="preserve"> </w:t>
       </w:r>
-      <w:hyperlink w:history="1" r:id="rIdnxjlpgqqeitlysevqu7s1">
+      <w:hyperlink w:history="1" r:id="rIdqaw1si06p3j_xwn_jxvl8">
         <w:r>
           <w:rPr>
             <w:rStyle w:val="Hyperlink"/>
@@ -2177,7 +2177,7 @@
       <w:r>
         <w:t xml:space="preserve"> </w:t>
       </w:r>
-      <w:hyperlink w:history="1" r:id="rId5mzdjtsprj5czo_dybmhw">
+      <w:hyperlink w:history="1" r:id="rIdwfjd2fmoxjh98vr3wywlw">
         <w:r>
           <w:rPr>
             <w:rStyle w:val="Hyperlink"/>
@@ -2208,7 +2208,7 @@
       <w:r>
         <w:t xml:space="preserve"> </w:t>
       </w:r>
-      <w:hyperlink w:history="1" r:id="rIdbkqjtnjtqxjwnd7gnjidr">
+      <w:hyperlink w:history="1" r:id="rIdtpmlv2nj1ycgwgbsbtb2w">
         <w:r>
           <w:rPr>
             <w:rStyle w:val="Hyperlink"/>
@@ -2239,7 +2239,7 @@
       <w:r>
         <w:t xml:space="preserve"> </w:t>
       </w:r>
-      <w:hyperlink w:history="1" r:id="rIdkf2cmcnraqaptvcnw0oxf">
+      <w:hyperlink w:history="1" r:id="rIdopjeasqmwqoukwbecsqne">
         <w:r>
           <w:rPr>
             <w:rStyle w:val="Hyperlink"/>
@@ -2270,7 +2270,7 @@
       <w:r>
         <w:t xml:space="preserve"> </w:t>
       </w:r>
-      <w:hyperlink w:history="1" r:id="rIdrsdxbnibcddzf4oorckuu">
+      <w:hyperlink w:history="1" r:id="rId_g7ajfmgfpwg568zr4ps_">
         <w:r>
           <w:rPr>
             <w:rStyle w:val="Hyperlink"/>
@@ -2301,7 +2301,7 @@
       <w:r>
         <w:t xml:space="preserve"> </w:t>
       </w:r>
-      <w:hyperlink w:history="1" r:id="rId1fcezsq3_lt4pgr5jplwd">
+      <w:hyperlink w:history="1" r:id="rIdaaiiknqahyuzvmm73kwf8">
         <w:r>
           <w:rPr>
             <w:rStyle w:val="Hyperlink"/>
@@ -2332,7 +2332,7 @@
       <w:r>
         <w:t xml:space="preserve"> </w:t>
       </w:r>
-      <w:hyperlink w:history="1" r:id="rIdtc2b9ablrrefy_zjdvmmc">
+      <w:hyperlink w:history="1" r:id="rIdhz_t4xlqbya9ksam8cusz">
         <w:r>
           <w:rPr>
             <w:rStyle w:val="Hyperlink"/>
@@ -2363,7 +2363,7 @@
       <w:r>
         <w:t xml:space="preserve"> </w:t>
       </w:r>
-      <w:hyperlink w:history="1" r:id="rIdhdyiojzfebyzusrps8-kr">
+      <w:hyperlink w:history="1" r:id="rIdhpc47grpkuxrd3b8rbhgt">
         <w:r>
           <w:rPr>
             <w:rStyle w:val="Hyperlink"/>
@@ -2394,7 +2394,7 @@
       <w:r>
         <w:t xml:space="preserve"> </w:t>
       </w:r>
-      <w:hyperlink w:history="1" r:id="rIdyaswokgmlzz0bxdd8ct0f">
+      <w:hyperlink w:history="1" r:id="rIdfab_z9dwjteptg484bdhg">
         <w:r>
           <w:rPr>
             <w:rStyle w:val="Hyperlink"/>
@@ -2425,7 +2425,7 @@
       <w:r>
         <w:t xml:space="preserve"> </w:t>
       </w:r>
-      <w:hyperlink w:history="1" r:id="rIdriyckgt34ipk4_luj5dsx">
+      <w:hyperlink w:history="1" r:id="rIdcgprwvptscnx8dyxkxryr">
         <w:r>
           <w:rPr>
             <w:rStyle w:val="Hyperlink"/>
@@ -2469,7 +2469,7 @@
       <w:r>
         <w:t xml:space="preserve"> </w:t>
       </w:r>
-      <w:hyperlink w:history="1" r:id="rIdow-jljjiaqwcl6e7dsvtj">
+      <w:hyperlink w:history="1" r:id="rIdhhmhdarx3is234kyitngi">
         <w:r>
           <w:rPr>
             <w:rStyle w:val="Hyperlink"/>
@@ -2500,7 +2500,7 @@
       <w:r>
         <w:t xml:space="preserve"> </w:t>
       </w:r>
-      <w:hyperlink w:history="1" r:id="rIdb8np1ixw0vbv37jvxp60j">
+      <w:hyperlink w:history="1" r:id="rIdu2g27jw6ysr9nes7amy13">
         <w:r>
           <w:rPr>
             <w:rStyle w:val="Hyperlink"/>

</xml_diff>

<commit_message>
Projet de recherche : titre original, P2 et échantillon reformulés, affirmations nuancées
Co-Authored-By: Claude Opus 5.5 <noreply@anthropic.com>
Claude-Session: https://claude.ai/code/session_014nDgLta1jkqmWhdFtwnAQa
</commit_message>
<xml_diff>
--- a/memoire/Projet_de_recherche_Jalon2.docx
+++ b/memoire/Projet_de_recherche_Jalon2.docx
@@ -45,23 +45,13 @@
           <w:sz w:val="32"/>
           <w:szCs w:val="32"/>
         </w:rPr>
-        <w:t xml:space="preserve">Les professionnels de la location touristique de courte durée face au durcissement des régulations urbaines : vers une évolution du business model ?</w:t>
-      </w:r>
-    </w:p>
-    <w:p>
-      <w:pPr>
-        <w:spacing w:after="360"/>
-        <w:jc w:val="center"/>
-      </w:pPr>
-      <w:r>
-        <w:rPr>
-          <w:i/>
-          <w:iCs/>
-          <w:sz w:val="26"/>
-          <w:szCs w:val="26"/>
-        </w:rPr>
-        <w:t xml:space="preserve">Une étude comparée Barcelone – Marseille</w:t>
-      </w:r>
+        <w:t xml:space="preserve">Le logement touristique et les tensions avec la population locale en Europe : exemples et possible évolution du business model</w:t>
+      </w:r>
+    </w:p>
+    <w:p>
+      <w:pPr>
+        <w:spacing w:after="240"/>
+      </w:pPr>
     </w:p>
     <w:p>
       <w:pPr>
@@ -204,7 +194,7 @@
         <w:t xml:space="preserve">Barcelone</w:t>
       </w:r>
       <w:r>
-        <w:t xml:space="preserve"> incarne la régulation la plus radicale d’Europe : après avoir gelé l’octroi de nouvelles licences, la municipalité a annoncé en 2024 le non-renouvellement des quelque 10 000 licences d’appartements touristiques à l’horizon 2028. </w:t>
+        <w:t xml:space="preserve"> applique l’une des régulations les plus restrictives d’Europe : après avoir gelé l’octroi de nouvelles licences, la municipalité a annoncé en 2024 son intention de ne plus renouveler les quelque 10 000 licences d’appartements touristiques d’ici novembre 2028, une mesure encore contestée par les professionnels du secteur. </w:t>
       </w:r>
       <w:r>
         <w:rPr>
@@ -214,7 +204,7 @@
         <w:t xml:space="preserve">Marseille</w:t>
       </w:r>
       <w:r>
-        <w:t xml:space="preserve"> s’inscrit dans le cadre français renforcé par la loi du 19 novembre 2024 (dite « loi Le Meur ») et a adopté en 2025 un règlement de changement d’usage qui conditionne désormais la mise en location touristique d’un logement non principal à une compensation. Ces deux terrains offrent ainsi un contraste précieux entre une régulation quasi prohibitive et une régulation restrictive mais encore négociable.</w:t>
+        <w:t xml:space="preserve"> s’inscrit dans le cadre français renforcé par la loi du 19 novembre 2024 (dite « loi Le Meur ») et a révisé en 2025 son règlement de changement d’usage, qui subordonne la mise en location touristique d’un logement non principal à une compensation ; ce règlement fait lui aussi l’objet d’un recours devant la juridiction administrative. Ces deux terrains offrent ainsi un contraste éclairant entre une régulation qui tend vers l’interdiction et une régulation restrictive mais encore négociable.</w:t>
       </w:r>
     </w:p>
     <w:p>
@@ -230,10 +220,10 @@
           <w:b/>
           <w:bCs/>
         </w:rPr>
-        <w:t xml:space="preserve">la manière dont les professionnels du secteur réagissent à ces régulations et reconfigurent leur modèle économique demeure peu explorée</w:t>
-      </w:r>
-      <w:r>
-        <w:t xml:space="preserve">. C’est précisément cet angle mort que ce mémoire se propose d’investir.</w:t>
+        <w:t xml:space="preserve">la manière dont les professionnels du secteur réagissent à ces régulations reste encore peu étudiée sous l’angle du business model</w:t>
+      </w:r>
+      <w:r>
+        <w:t xml:space="preserve">. C’est sur ce point que ce mémoire entend apporter une contribution.</w:t>
       </w:r>
     </w:p>
     <w:p>
@@ -242,6 +232,15 @@
       </w:pPr>
       <w:r>
         <w:t xml:space="preserve">2. Problématique et questions de recherche</w:t>
+      </w:r>
+    </w:p>
+    <w:p>
+      <w:pPr>
+        <w:spacing w:after="140" w:line="360"/>
+        <w:jc w:val="both"/>
+      </w:pPr>
+      <w:r>
+        <w:t xml:space="preserve">Au sein de ce sujet, la problématique se concentre sur les professionnels du secteur et sur la manière dont ils font évoluer leur modèle économique, à travers une étude comparée de Barcelone et de Marseille :</w:t>
       </w:r>
     </w:p>
     <w:p>
@@ -503,7 +502,7 @@
         <w:t xml:space="preserve">P2 – </w:t>
       </w:r>
       <w:r>
-        <w:t xml:space="preserve">Les opérateurs les plus professionnalisés disposent d’une capacité d’adaptation supérieure à celle des hôtes particuliers et tendent à reconfigurer leur modèle plutôt qu’à quitter le marché.</w:t>
+        <w:t xml:space="preserve">Les stratégies d’adaptation diffèrent selon le type d’acteur : les conciergeries, dont le modèle repose sur la gestion pour le compte de tiers, tendent à diversifier leur offre (location de moyenne durée, autres services immobiliers), tandis que les multi-propriétaires arbitrent davantage entre mise en conformité, réallocation de leur parc et sortie du marché.</w:t>
       </w:r>
     </w:p>
     <w:p>
@@ -572,10 +571,10 @@
           <w:b/>
           <w:bCs/>
         </w:rPr>
-        <w:t xml:space="preserve">16 à 18 entretiens semi-directifs</w:t>
-      </w:r>
-      <w:r>
-        <w:t xml:space="preserve"> auprès de professionnels du secteur, soit huit à neuf par ville, ce qui dépasse le seuil de douze entretiens B2B attendu pour un mémoire en binôme :</w:t>
+        <w:t xml:space="preserve">14 à 16 entretiens semi-directifs</w:t>
+      </w:r>
+      <w:r>
+        <w:t xml:space="preserve"> auprès de professionnels du secteur, soit sept à huit par ville, ce qui dépasse le seuil de douze entretiens B2B attendu pour un mémoire en binôme. Deux entretiens de contexte avec des associations professionnelles compléteront le dispositif, sans être comptabilisés dans ce corpus :</w:t>
       </w:r>
     </w:p>
     <w:tbl>
@@ -985,7 +984,7 @@
                 <w:sz w:val="20"/>
                 <w:szCs w:val="20"/>
               </w:rPr>
-              <w:t xml:space="preserve">Association professionnelle du secteur (contexte)</w:t>
+              <w:t xml:space="preserve">Total du corpus analysé</w:t>
             </w:r>
           </w:p>
         </w:tc>
@@ -1013,7 +1012,7 @@
                 <w:sz w:val="20"/>
                 <w:szCs w:val="20"/>
               </w:rPr>
-              <w:t xml:space="preserve">1</w:t>
+              <w:t xml:space="preserve">7 à 8</w:t>
             </w:r>
           </w:p>
         </w:tc>
@@ -1041,7 +1040,7 @@
                 <w:sz w:val="20"/>
                 <w:szCs w:val="20"/>
               </w:rPr>
-              <w:t xml:space="preserve">1</w:t>
+              <w:t xml:space="preserve">7 à 8</w:t>
             </w:r>
           </w:p>
         </w:tc>
@@ -1074,7 +1073,7 @@
                 <w:sz w:val="20"/>
                 <w:szCs w:val="20"/>
               </w:rPr>
-              <w:t xml:space="preserve">Total</w:t>
+              <w:t xml:space="preserve">Entretien de contexte : association professionnelle (hors corpus)</w:t>
             </w:r>
           </w:p>
         </w:tc>
@@ -1102,7 +1101,7 @@
                 <w:sz w:val="20"/>
                 <w:szCs w:val="20"/>
               </w:rPr>
-              <w:t xml:space="preserve">8 à 9</w:t>
+              <w:t xml:space="preserve">1</w:t>
             </w:r>
           </w:p>
         </w:tc>
@@ -1130,7 +1129,7 @@
                 <w:sz w:val="20"/>
                 <w:szCs w:val="20"/>
               </w:rPr>
-              <w:t xml:space="preserve">8 à 9</w:t>
+              <w:t xml:space="preserve">1</w:t>
             </w:r>
           </w:p>
         </w:tc>
@@ -1960,7 +1959,7 @@
       <w:r>
         <w:t xml:space="preserve"> </w:t>
       </w:r>
-      <w:hyperlink w:history="1" r:id="rIdg3xklxm0ov_v2lkpqotid">
+      <w:hyperlink w:history="1" r:id="rIdwta3u25ljzzkanbhcmvj0">
         <w:r>
           <w:rPr>
             <w:rStyle w:val="Hyperlink"/>
@@ -1991,7 +1990,7 @@
       <w:r>
         <w:t xml:space="preserve"> </w:t>
       </w:r>
-      <w:hyperlink w:history="1" r:id="rId2ggdu6syis3imtgd_0kob">
+      <w:hyperlink w:history="1" r:id="rIdz2uqjtwnoughtzsciau-k">
         <w:r>
           <w:rPr>
             <w:rStyle w:val="Hyperlink"/>
@@ -2022,7 +2021,7 @@
       <w:r>
         <w:t xml:space="preserve"> </w:t>
       </w:r>
-      <w:hyperlink w:history="1" r:id="rIddol2dv54usggeodn0xxqc">
+      <w:hyperlink w:history="1" r:id="rIdbeuyolmd7wtplwbobje6g">
         <w:r>
           <w:rPr>
             <w:rStyle w:val="Hyperlink"/>
@@ -2053,7 +2052,7 @@
       <w:r>
         <w:t xml:space="preserve"> </w:t>
       </w:r>
-      <w:hyperlink w:history="1" r:id="rIdoozr-wpgkrysmxognpfja">
+      <w:hyperlink w:history="1" r:id="rIdqwsp1bbqj-idfeiquwax5">
         <w:r>
           <w:rPr>
             <w:rStyle w:val="Hyperlink"/>
@@ -2079,12 +2078,12 @@
         <w:t xml:space="preserve">Journal of Urban Economics, 119</w:t>
       </w:r>
       <w:r>
-        <w:t xml:space="preserve">, 103278.</w:t>
+        <w:t xml:space="preserve">, Article 103278.</w:t>
       </w:r>
       <w:r>
         <w:t xml:space="preserve"> </w:t>
       </w:r>
-      <w:hyperlink w:history="1" r:id="rIdw9dulu1lgzqrq9vi8jt8y">
+      <w:hyperlink w:history="1" r:id="rIdf5kqie-gfe3dpovn1xj41">
         <w:r>
           <w:rPr>
             <w:rStyle w:val="Hyperlink"/>
@@ -2115,7 +2114,7 @@
       <w:r>
         <w:t xml:space="preserve"> </w:t>
       </w:r>
-      <w:hyperlink w:history="1" r:id="rIdmoteklrjvbgyuzpan2fnx">
+      <w:hyperlink w:history="1" r:id="rIdd0dtvbpxf4fzjw_ex3l4o">
         <w:r>
           <w:rPr>
             <w:rStyle w:val="Hyperlink"/>
@@ -2146,7 +2145,7 @@
       <w:r>
         <w:t xml:space="preserve"> </w:t>
       </w:r>
-      <w:hyperlink w:history="1" r:id="rIdqaw1si06p3j_xwn_jxvl8">
+      <w:hyperlink w:history="1" r:id="rIdvd-ittvq15irn7xjergxr">
         <w:r>
           <w:rPr>
             <w:rStyle w:val="Hyperlink"/>
@@ -2177,7 +2176,7 @@
       <w:r>
         <w:t xml:space="preserve"> </w:t>
       </w:r>
-      <w:hyperlink w:history="1" r:id="rIdwfjd2fmoxjh98vr3wywlw">
+      <w:hyperlink w:history="1" r:id="rIdgonpmqmnjlhm68m_sziee">
         <w:r>
           <w:rPr>
             <w:rStyle w:val="Hyperlink"/>
@@ -2208,7 +2207,7 @@
       <w:r>
         <w:t xml:space="preserve"> </w:t>
       </w:r>
-      <w:hyperlink w:history="1" r:id="rIdtpmlv2nj1ycgwgbsbtb2w">
+      <w:hyperlink w:history="1" r:id="rId7pnnovhd9x_8afgz_vzms">
         <w:r>
           <w:rPr>
             <w:rStyle w:val="Hyperlink"/>
@@ -2239,7 +2238,7 @@
       <w:r>
         <w:t xml:space="preserve"> </w:t>
       </w:r>
-      <w:hyperlink w:history="1" r:id="rIdopjeasqmwqoukwbecsqne">
+      <w:hyperlink w:history="1" r:id="rIdes-qhf67uuheykppbwcte">
         <w:r>
           <w:rPr>
             <w:rStyle w:val="Hyperlink"/>
@@ -2270,7 +2269,7 @@
       <w:r>
         <w:t xml:space="preserve"> </w:t>
       </w:r>
-      <w:hyperlink w:history="1" r:id="rId_g7ajfmgfpwg568zr4ps_">
+      <w:hyperlink w:history="1" r:id="rId_7fm1l6o4njznxjkelyre">
         <w:r>
           <w:rPr>
             <w:rStyle w:val="Hyperlink"/>
@@ -2301,7 +2300,7 @@
       <w:r>
         <w:t xml:space="preserve"> </w:t>
       </w:r>
-      <w:hyperlink w:history="1" r:id="rIdaaiiknqahyuzvmm73kwf8">
+      <w:hyperlink w:history="1" r:id="rId0rdvlnww9ker6fv2wycts">
         <w:r>
           <w:rPr>
             <w:rStyle w:val="Hyperlink"/>
@@ -2332,7 +2331,7 @@
       <w:r>
         <w:t xml:space="preserve"> </w:t>
       </w:r>
-      <w:hyperlink w:history="1" r:id="rIdhz_t4xlqbya9ksam8cusz">
+      <w:hyperlink w:history="1" r:id="rIdx9hhemzw7r6dzeswny-tb">
         <w:r>
           <w:rPr>
             <w:rStyle w:val="Hyperlink"/>
@@ -2363,7 +2362,7 @@
       <w:r>
         <w:t xml:space="preserve"> </w:t>
       </w:r>
-      <w:hyperlink w:history="1" r:id="rIdhpc47grpkuxrd3b8rbhgt">
+      <w:hyperlink w:history="1" r:id="rId6ekwovbpxwacc2x0qnkwr">
         <w:r>
           <w:rPr>
             <w:rStyle w:val="Hyperlink"/>
@@ -2394,7 +2393,7 @@
       <w:r>
         <w:t xml:space="preserve"> </w:t>
       </w:r>
-      <w:hyperlink w:history="1" r:id="rIdfab_z9dwjteptg484bdhg">
+      <w:hyperlink w:history="1" r:id="rIdcujsd_wwcfelc9ieusk-a">
         <w:r>
           <w:rPr>
             <w:rStyle w:val="Hyperlink"/>
@@ -2425,7 +2424,7 @@
       <w:r>
         <w:t xml:space="preserve"> </w:t>
       </w:r>
-      <w:hyperlink w:history="1" r:id="rIdcgprwvptscnx8dyxkxryr">
+      <w:hyperlink w:history="1" r:id="rId8jxjh0e9g3yp3ysl2wgi3">
         <w:r>
           <w:rPr>
             <w:rStyle w:val="Hyperlink"/>
@@ -2469,7 +2468,7 @@
       <w:r>
         <w:t xml:space="preserve"> </w:t>
       </w:r>
-      <w:hyperlink w:history="1" r:id="rIdhhmhdarx3is234kyitngi">
+      <w:hyperlink w:history="1" r:id="rIdag1yeh2mklmoujrcbzrvs">
         <w:r>
           <w:rPr>
             <w:rStyle w:val="Hyperlink"/>
@@ -2500,7 +2499,7 @@
       <w:r>
         <w:t xml:space="preserve"> </w:t>
       </w:r>
-      <w:hyperlink w:history="1" r:id="rIdu2g27jw6ysr9nes7amy13">
+      <w:hyperlink w:history="1" r:id="rIdf13n20educ-gsiosxrsly">
         <w:r>
           <w:rPr>
             <w:rStyle w:val="Hyperlink"/>

</xml_diff>

<commit_message>
Projet de recherche : objectifs, dimensions du business model, éthique et saturation
Co-Authored-By: Claude Opus 5.5 <noreply@anthropic.com>
Claude-Session: https://claude.ai/code/session_014nDgLta1jkqmWhdFtwnAQa
</commit_message>
<xml_diff>
--- a/memoire/Projet_de_recherche_Jalon2.docx
+++ b/memoire/Projet_de_recherche_Jalon2.docx
@@ -330,10 +330,35 @@
     </w:p>
     <w:p>
       <w:pPr>
-        <w:pStyle w:val="Heading1"/>
-      </w:pPr>
-      <w:r>
-        <w:t xml:space="preserve">3. Enjeux de la recherche</w:t>
+        <w:pStyle w:val="Heading2"/>
+      </w:pPr>
+      <w:r>
+        <w:t xml:space="preserve">Objectifs de la recherche</w:t>
+      </w:r>
+    </w:p>
+    <w:p>
+      <w:pPr>
+        <w:spacing w:after="140" w:line="360"/>
+        <w:jc w:val="both"/>
+      </w:pPr>
+      <w:r>
+        <w:rPr>
+          <w:b/>
+          <w:bCs/>
+        </w:rPr>
+        <w:t xml:space="preserve">Objectif général : </w:t>
+      </w:r>
+      <w:r>
+        <w:t xml:space="preserve">comprendre comment les professionnels de la location touristique de courte durée font évoluer leur business model sous l’effet du durcissement des régulations urbaines.</w:t>
+      </w:r>
+    </w:p>
+    <w:p>
+      <w:pPr>
+        <w:spacing w:after="140" w:line="360"/>
+        <w:jc w:val="both"/>
+      </w:pPr>
+      <w:r>
+        <w:t xml:space="preserve">Objectifs spécifiques :</w:t>
       </w:r>
     </w:p>
     <w:p>
@@ -347,14 +372,7 @@
         <w:jc w:val="both"/>
       </w:pPr>
       <w:r>
-        <w:rPr>
-          <w:b/>
-          <w:bCs/>
-        </w:rPr>
-        <w:t xml:space="preserve">Enjeu académique. </w:t>
-      </w:r>
-      <w:r>
-        <w:t xml:space="preserve">Le mémoire articule deux champs encore peu connectés : la littérature sur la location touristique, centrée sur ses impacts urbains, et celle sur l’adaptation des business models face aux pressions institutionnelles. Le design comparatif, fondé sur deux intensités de régulation, permet d’interroger le lien entre degré de contrainte et profondeur de l’adaptation.</w:t>
+        <w:t xml:space="preserve">Caractériser les régulations adoptées à Barcelone et à Marseille, ainsi que les tensions qui les ont motivées.</w:t>
       </w:r>
     </w:p>
     <w:p>
@@ -368,14 +386,7 @@
         <w:jc w:val="both"/>
       </w:pPr>
       <w:r>
-        <w:rPr>
-          <w:b/>
-          <w:bCs/>
-        </w:rPr>
-        <w:t xml:space="preserve">Enjeu managérial. </w:t>
-      </w:r>
-      <w:r>
-        <w:t xml:space="preserve">Les résultats doivent fournir aux gestionnaires, conciergeries et investisseurs une grille de lecture des options stratégiques disponibles face à un environnement réglementaire mouvant, ainsi que des enseignements pour les plateformes elles-mêmes.</w:t>
+        <w:t xml:space="preserve">Identifier et classer les stratégies d’adaptation mises en œuvre par les professionnels, selon leur profil et l’intensité de la régulation à laquelle ils sont soumis.</w:t>
       </w:r>
     </w:p>
     <w:p>
@@ -389,14 +400,7 @@
         <w:jc w:val="both"/>
       </w:pPr>
       <w:r>
-        <w:rPr>
-          <w:b/>
-          <w:bCs/>
-        </w:rPr>
-        <w:t xml:space="preserve">Enjeu sociétal (ODD 11). </w:t>
-      </w:r>
-      <w:r>
-        <w:t xml:space="preserve">Comprendre comment le secteur se recompose éclaire les conditions d’une coexistence soutenable entre économie touristique et droit au logement, et offre aux collectivités un retour sur les effets concrets de leurs politiques.</w:t>
+        <w:t xml:space="preserve">Proposer une typologie des évolutions du business model du secteur et en tirer des recommandations managériales.</w:t>
       </w:r>
     </w:p>
     <w:p>
@@ -404,63 +408,7 @@
         <w:pStyle w:val="Heading1"/>
       </w:pPr>
       <w:r>
-        <w:t xml:space="preserve">4. Cadre théorique envisagé</w:t>
-      </w:r>
-    </w:p>
-    <w:p>
-      <w:pPr>
-        <w:spacing w:after="140" w:line="360"/>
-        <w:jc w:val="both"/>
-      </w:pPr>
-      <w:r>
-        <w:t xml:space="preserve">Le mémoire mobilisera </w:t>
-      </w:r>
-      <w:r>
-        <w:rPr>
-          <w:b/>
-          <w:bCs/>
-        </w:rPr>
-        <w:t xml:space="preserve">la littérature sur le business model</w:t>
-      </w:r>
-      <w:r>
-        <w:t xml:space="preserve">, entendu comme l’architecture par laquelle une entreprise crée, délivre et capte de la valeur (Teece, 2010 ; Zott et al., 2011), et plus spécifiquement les travaux sur l’innovation et l’adaptation du business model (Foss &amp; Saebi, 2017). Saebi et al. (2017) montrent notamment que les entreprises adaptent davantage leur modèle lorsqu’elles perçoivent une menace que lorsqu’elles identifient une opportunité, ce qui fait de la régulation un déclencheur pertinent à étudier.</w:t>
-      </w:r>
-    </w:p>
-    <w:p>
-      <w:pPr>
-        <w:spacing w:after="140" w:line="360"/>
-        <w:jc w:val="both"/>
-      </w:pPr>
-      <w:r>
-        <w:t xml:space="preserve">Ce socle sera complété par </w:t>
-      </w:r>
-      <w:r>
-        <w:rPr>
-          <w:b/>
-          <w:bCs/>
-        </w:rPr>
-        <w:t xml:space="preserve">la théorie néo-institutionnelle</w:t>
-      </w:r>
-      <w:r>
-        <w:t xml:space="preserve">. La typologie des réponses stratégiques aux pressions institutionnelles proposée par Oliver (1991) – acquiescement, compromis, évitement, défiance et manipulation – servira de grille de lecture initiale pour classer les comportements observés. Les travaux d’Uzunca et al. (2018) sur la manière dont les entreprises de l’économie collaborative façonnent leur environnement institutionnel selon les pays prolongeront cette perspective dans une logique comparative.</w:t>
-      </w:r>
-    </w:p>
-    <w:p>
-      <w:pPr>
-        <w:spacing w:after="140" w:line="360"/>
-        <w:jc w:val="both"/>
-      </w:pPr>
-      <w:r>
-        <w:t xml:space="preserve">Enfin, la littérature spécifique à la location touristique (Guttentag, 2015 ; Zervas et al., 2017 ; Gurran &amp; Phibbs, 2017 ; Nieuwland &amp; van Melik, 2020) permettra de contextualiser les régulations et leurs justifications.</w:t>
-      </w:r>
-    </w:p>
-    <w:p>
-      <w:pPr>
-        <w:spacing w:after="140" w:line="360"/>
-        <w:jc w:val="both"/>
-      </w:pPr>
-      <w:r>
-        <w:t xml:space="preserve">À ce stade, deux propositions exploratoires guident la recherche :</w:t>
+        <w:t xml:space="preserve">3. Enjeux de la recherche</w:t>
       </w:r>
     </w:p>
     <w:p>
@@ -468,7 +416,7 @@
         <w:pStyle w:val="ListParagraph"/>
         <w:numPr>
           <w:ilvl w:val="0"/>
-          <w:numId w:val="3"/>
+          <w:numId w:val="4"/>
         </w:numPr>
         <w:spacing w:after="80" w:line="360"/>
         <w:jc w:val="both"/>
@@ -478,10 +426,10 @@
           <w:b/>
           <w:bCs/>
         </w:rPr>
-        <w:t xml:space="preserve">P1 – </w:t>
-      </w:r>
-      <w:r>
-        <w:t xml:space="preserve">Plus la régulation est contraignante, plus l’adaptation du business model est radicale (pivot ou sortie à Barcelone, ajustements incrémentaux à Marseille).</w:t>
+        <w:t xml:space="preserve">Enjeu académique. </w:t>
+      </w:r>
+      <w:r>
+        <w:t xml:space="preserve">Le mémoire articule deux champs encore peu connectés : la littérature sur la location touristique, centrée sur ses impacts urbains, et celle sur l’adaptation des business models face aux pressions institutionnelles. Le design comparatif, fondé sur deux intensités de régulation, permet d’interroger le lien entre degré de contrainte et profondeur de l’adaptation.</w:t>
       </w:r>
     </w:p>
     <w:p>
@@ -489,7 +437,203 @@
         <w:pStyle w:val="ListParagraph"/>
         <w:numPr>
           <w:ilvl w:val="0"/>
-          <w:numId w:val="3"/>
+          <w:numId w:val="4"/>
+        </w:numPr>
+        <w:spacing w:after="80" w:line="360"/>
+        <w:jc w:val="both"/>
+      </w:pPr>
+      <w:r>
+        <w:rPr>
+          <w:b/>
+          <w:bCs/>
+        </w:rPr>
+        <w:t xml:space="preserve">Enjeu managérial. </w:t>
+      </w:r>
+      <w:r>
+        <w:t xml:space="preserve">Les résultats doivent fournir aux gestionnaires, conciergeries et investisseurs une grille de lecture des options stratégiques disponibles face à un environnement réglementaire mouvant, ainsi que des enseignements pour les plateformes elles-mêmes.</w:t>
+      </w:r>
+    </w:p>
+    <w:p>
+      <w:pPr>
+        <w:pStyle w:val="ListParagraph"/>
+        <w:numPr>
+          <w:ilvl w:val="0"/>
+          <w:numId w:val="4"/>
+        </w:numPr>
+        <w:spacing w:after="80" w:line="360"/>
+        <w:jc w:val="both"/>
+      </w:pPr>
+      <w:r>
+        <w:rPr>
+          <w:b/>
+          <w:bCs/>
+        </w:rPr>
+        <w:t xml:space="preserve">Enjeu sociétal (ODD 11). </w:t>
+      </w:r>
+      <w:r>
+        <w:t xml:space="preserve">Comprendre comment le secteur se recompose éclaire les conditions d’une coexistence soutenable entre économie touristique et droit au logement, et offre aux collectivités un retour sur les effets concrets de leurs politiques.</w:t>
+      </w:r>
+    </w:p>
+    <w:p>
+      <w:pPr>
+        <w:pStyle w:val="Heading1"/>
+      </w:pPr>
+      <w:r>
+        <w:t xml:space="preserve">4. Cadre théorique envisagé</w:t>
+      </w:r>
+    </w:p>
+    <w:p>
+      <w:pPr>
+        <w:spacing w:after="140" w:line="360"/>
+        <w:jc w:val="both"/>
+      </w:pPr>
+      <w:r>
+        <w:t xml:space="preserve">Le mémoire mobilisera </w:t>
+      </w:r>
+      <w:r>
+        <w:rPr>
+          <w:b/>
+          <w:bCs/>
+        </w:rPr>
+        <w:t xml:space="preserve">la littérature sur le business model</w:t>
+      </w:r>
+      <w:r>
+        <w:t xml:space="preserve">, entendu comme l’architecture par laquelle une entreprise crée, délivre et capte de la valeur (Teece, 2010 ; Zott et al., 2011), et plus spécifiquement les travaux sur l’innovation et l’adaptation du business model (Foss &amp; Saebi, 2017). Saebi et al. (2017) montrent notamment que les entreprises adaptent davantage leur modèle lorsqu’elles perçoivent une menace que lorsqu’elles identifient une opportunité, ce qui fait de la régulation un déclencheur pertinent à étudier.</w:t>
+      </w:r>
+    </w:p>
+    <w:p>
+      <w:pPr>
+        <w:spacing w:after="140" w:line="360"/>
+        <w:jc w:val="both"/>
+      </w:pPr>
+      <w:r>
+        <w:t xml:space="preserve">Pour rendre ce concept observable, le business model sera décomposé en </w:t>
+      </w:r>
+      <w:r>
+        <w:rPr>
+          <w:b/>
+          <w:bCs/>
+        </w:rPr>
+        <w:t xml:space="preserve">cinq dimensions</w:t>
+      </w:r>
+      <w:r>
+        <w:t xml:space="preserve"> classiquement retenues dans la littérature (Teece, 2010 ; Zott et al., 2011) : la </w:t>
+      </w:r>
+      <w:r>
+        <w:rPr>
+          <w:b/>
+          <w:bCs/>
+        </w:rPr>
+        <w:t xml:space="preserve">proposition de valeur</w:t>
+      </w:r>
+      <w:r>
+        <w:t xml:space="preserve"> (le type de séjour et de service offert), les </w:t>
+      </w:r>
+      <w:r>
+        <w:rPr>
+          <w:b/>
+          <w:bCs/>
+        </w:rPr>
+        <w:t xml:space="preserve">segments de clientèle</w:t>
+      </w:r>
+      <w:r>
+        <w:t xml:space="preserve"> (touristes, voyageurs d’affaires, locataires de moyenne durée), les </w:t>
+      </w:r>
+      <w:r>
+        <w:rPr>
+          <w:b/>
+          <w:bCs/>
+        </w:rPr>
+        <w:t xml:space="preserve">canaux de distribution</w:t>
+      </w:r>
+      <w:r>
+        <w:t xml:space="preserve"> (plateformes, vente directe, agences), les </w:t>
+      </w:r>
+      <w:r>
+        <w:rPr>
+          <w:b/>
+          <w:bCs/>
+        </w:rPr>
+        <w:t xml:space="preserve">sources de revenus</w:t>
+      </w:r>
+      <w:r>
+        <w:t xml:space="preserve"> (nuitées, commissions de gestion, services annexes) et la </w:t>
+      </w:r>
+      <w:r>
+        <w:rPr>
+          <w:b/>
+          <w:bCs/>
+        </w:rPr>
+        <w:t xml:space="preserve">structure de coûts</w:t>
+      </w:r>
+      <w:r>
+        <w:t xml:space="preserve"> (mise en conformité, fiscalité, gestion opérationnelle). Ces dimensions structureront à la fois le guide d’entretien et la grille d’analyse : une adaptation sera repérée dès lors qu’au moins l’une d’elles est modifiée en réponse à la régulation.</w:t>
+      </w:r>
+    </w:p>
+    <w:p>
+      <w:pPr>
+        <w:spacing w:after="140" w:line="360"/>
+        <w:jc w:val="both"/>
+      </w:pPr>
+      <w:r>
+        <w:t xml:space="preserve">Ce socle sera complété par </w:t>
+      </w:r>
+      <w:r>
+        <w:rPr>
+          <w:b/>
+          <w:bCs/>
+        </w:rPr>
+        <w:t xml:space="preserve">la théorie néo-institutionnelle</w:t>
+      </w:r>
+      <w:r>
+        <w:t xml:space="preserve">. La typologie des réponses stratégiques aux pressions institutionnelles proposée par Oliver (1991) – acquiescement, compromis, évitement, défiance et manipulation – servira de grille de lecture initiale pour classer les comportements observés. Les travaux d’Uzunca et al. (2018) sur la manière dont les entreprises de l’économie collaborative façonnent leur environnement institutionnel selon les pays prolongeront cette perspective dans une logique comparative.</w:t>
+      </w:r>
+    </w:p>
+    <w:p>
+      <w:pPr>
+        <w:spacing w:after="140" w:line="360"/>
+        <w:jc w:val="both"/>
+      </w:pPr>
+      <w:r>
+        <w:t xml:space="preserve">Enfin, la littérature spécifique à la location touristique (Guttentag, 2015 ; Zervas et al., 2017 ; Gurran &amp; Phibbs, 2017 ; Nieuwland &amp; van Melik, 2020) permettra de contextualiser les régulations et leurs justifications.</w:t>
+      </w:r>
+    </w:p>
+    <w:p>
+      <w:pPr>
+        <w:spacing w:after="140" w:line="360"/>
+        <w:jc w:val="both"/>
+      </w:pPr>
+      <w:r>
+        <w:t xml:space="preserve">À ce stade, deux propositions exploratoires guident la recherche :</w:t>
+      </w:r>
+    </w:p>
+    <w:p>
+      <w:pPr>
+        <w:pStyle w:val="ListParagraph"/>
+        <w:numPr>
+          <w:ilvl w:val="0"/>
+          <w:numId w:val="4"/>
+        </w:numPr>
+        <w:spacing w:after="80" w:line="360"/>
+        <w:jc w:val="both"/>
+      </w:pPr>
+      <w:r>
+        <w:rPr>
+          <w:b/>
+          <w:bCs/>
+        </w:rPr>
+        <w:t xml:space="preserve">P1 – </w:t>
+      </w:r>
+      <w:r>
+        <w:t xml:space="preserve">Plus la régulation est contraignante, plus l’adaptation du business model est radicale (pivot ou sortie à Barcelone, ajustements incrémentaux à Marseille).</w:t>
+      </w:r>
+    </w:p>
+    <w:p>
+      <w:pPr>
+        <w:pStyle w:val="ListParagraph"/>
+        <w:numPr>
+          <w:ilvl w:val="0"/>
+          <w:numId w:val="4"/>
         </w:numPr>
         <w:spacing w:after="80" w:line="360"/>
         <w:jc w:val="both"/>
@@ -1166,7 +1310,7 @@
         <w:pStyle w:val="ListParagraph"/>
         <w:numPr>
           <w:ilvl w:val="0"/>
-          <w:numId w:val="3"/>
+          <w:numId w:val="4"/>
         </w:numPr>
         <w:spacing w:after="80" w:line="360"/>
         <w:jc w:val="both"/>
@@ -1180,13 +1324,13 @@
         <w:pStyle w:val="ListParagraph"/>
         <w:numPr>
           <w:ilvl w:val="0"/>
-          <w:numId w:val="3"/>
+          <w:numId w:val="4"/>
         </w:numPr>
         <w:spacing w:after="80" w:line="360"/>
         <w:jc w:val="both"/>
       </w:pPr>
       <w:r>
-        <w:t xml:space="preserve">Entretiens barcelonais menés en espagnol, retranscrits dans la langue d’origine ; les extraits cités seront traduits et le processus de traduction documenté.</w:t>
+        <w:t xml:space="preserve">Entretiens barcelonais menés en anglais ou en espagnol selon la préférence du répondant, retranscrits dans la langue d’origine ; les extraits cités seront traduits et le processus de traduction documenté.</w:t>
       </w:r>
     </w:p>
     <w:p>
@@ -1194,12 +1338,75 @@
         <w:pStyle w:val="ListParagraph"/>
         <w:numPr>
           <w:ilvl w:val="0"/>
-          <w:numId w:val="3"/>
+          <w:numId w:val="4"/>
         </w:numPr>
         <w:spacing w:after="80" w:line="360"/>
         <w:jc w:val="both"/>
       </w:pPr>
       <w:r>
+        <w:rPr>
+          <w:b/>
+          <w:bCs/>
+        </w:rPr>
+        <w:t xml:space="preserve">Consentement éclairé : </w:t>
+      </w:r>
+      <w:r>
+        <w:t xml:space="preserve">chaque participant signera un formulaire précisant l’objet de l’étude, l’enregistrement de l’entretien, l’anonymisation des données et son droit de retrait.</w:t>
+      </w:r>
+    </w:p>
+    <w:p>
+      <w:pPr>
+        <w:pStyle w:val="ListParagraph"/>
+        <w:numPr>
+          <w:ilvl w:val="0"/>
+          <w:numId w:val="4"/>
+        </w:numPr>
+        <w:spacing w:after="80" w:line="360"/>
+        <w:jc w:val="both"/>
+      </w:pPr>
+      <w:r>
+        <w:rPr>
+          <w:b/>
+          <w:bCs/>
+        </w:rPr>
+        <w:t xml:space="preserve">Saturation : </w:t>
+      </w:r>
+      <w:r>
+        <w:t xml:space="preserve">la taille finale de l’échantillon sera ajustée selon le principe de saturation théorique ; la collecte se poursuivra jusqu’à ce que de nouveaux entretiens n’apportent plus d’éléments significativement nouveaux.</w:t>
+      </w:r>
+    </w:p>
+    <w:p>
+      <w:pPr>
+        <w:pStyle w:val="ListParagraph"/>
+        <w:numPr>
+          <w:ilvl w:val="0"/>
+          <w:numId w:val="4"/>
+        </w:numPr>
+        <w:spacing w:after="80" w:line="360"/>
+        <w:jc w:val="both"/>
+      </w:pPr>
+      <w:r>
+        <w:rPr>
+          <w:b/>
+          <w:bCs/>
+        </w:rPr>
+        <w:t xml:space="preserve">Traçabilité : </w:t>
+      </w:r>
+      <w:r>
+        <w:t xml:space="preserve">l’ensemble des matériaux (guide d’entretien, enregistrements, transcriptions, notes de terrain, preuves de prise de contact) sera conservé jusqu’à la validation du mémoire, conformément aux exigences du guide KEDGE.</w:t>
+      </w:r>
+    </w:p>
+    <w:p>
+      <w:pPr>
+        <w:pStyle w:val="ListParagraph"/>
+        <w:numPr>
+          <w:ilvl w:val="0"/>
+          <w:numId w:val="4"/>
+        </w:numPr>
+        <w:spacing w:after="80" w:line="360"/>
+        <w:jc w:val="both"/>
+      </w:pPr>
+      <w:r>
         <w:t xml:space="preserve">Triangulation par des données secondaires : textes réglementaires, rapports annuels et communications d’Airbnb, données publiques sur l’évolution des annonces.</w:t>
       </w:r>
     </w:p>
@@ -1271,7 +1478,7 @@
         <w:jc w:val="both"/>
       </w:pPr>
       <w:r>
-        <w:t xml:space="preserve">Trois limites sont identifiées dès à présent : le biais déclaratif propre aux entretiens, la difficulté d’accéder aux acteurs opérant hors du cadre légal, et le caractère en partie anticipé des adaptations à Barcelone, où la fin des licences n’interviendra qu’en 2028. Cette dernière limite constitue aussi un intérêt de la recherche : observer comment des acteurs se préparent à une rupture réglementaire annoncée.</w:t>
+        <w:t xml:space="preserve">Trois limites sont identifiées dès à présent : le biais déclaratif propre aux entretiens, la difficulté d’accéder aux acteurs opérant hors du cadre légal, et le caractère en partie anticipé des adaptations à Barcelone, où la fin des licences n’est annoncée que pour 2028. Cette dernière limite constitue aussi un intérêt de la recherche : observer comment des acteurs se préparent à une rupture réglementaire annoncée.</w:t>
       </w:r>
     </w:p>
     <w:p>
@@ -1959,7 +2166,7 @@
       <w:r>
         <w:t xml:space="preserve"> </w:t>
       </w:r>
-      <w:hyperlink w:history="1" r:id="rIdwta3u25ljzzkanbhcmvj0">
+      <w:hyperlink w:history="1" r:id="rIdv0ai7iouo0-goj-arqewu">
         <w:r>
           <w:rPr>
             <w:rStyle w:val="Hyperlink"/>
@@ -1990,7 +2197,7 @@
       <w:r>
         <w:t xml:space="preserve"> </w:t>
       </w:r>
-      <w:hyperlink w:history="1" r:id="rIdz2uqjtwnoughtzsciau-k">
+      <w:hyperlink w:history="1" r:id="rIdceycmwyebdxbs0uveuxkq">
         <w:r>
           <w:rPr>
             <w:rStyle w:val="Hyperlink"/>
@@ -2021,7 +2228,7 @@
       <w:r>
         <w:t xml:space="preserve"> </w:t>
       </w:r>
-      <w:hyperlink w:history="1" r:id="rIdbeuyolmd7wtplwbobje6g">
+      <w:hyperlink w:history="1" r:id="rIdenjlnjnlczo9uv4btltpu">
         <w:r>
           <w:rPr>
             <w:rStyle w:val="Hyperlink"/>
@@ -2052,7 +2259,7 @@
       <w:r>
         <w:t xml:space="preserve"> </w:t>
       </w:r>
-      <w:hyperlink w:history="1" r:id="rIdqwsp1bbqj-idfeiquwax5">
+      <w:hyperlink w:history="1" r:id="rIdbicpxsravaw7ttqpk6iww">
         <w:r>
           <w:rPr>
             <w:rStyle w:val="Hyperlink"/>
@@ -2083,7 +2290,7 @@
       <w:r>
         <w:t xml:space="preserve"> </w:t>
       </w:r>
-      <w:hyperlink w:history="1" r:id="rIdf5kqie-gfe3dpovn1xj41">
+      <w:hyperlink w:history="1" r:id="rIdtqhfv65eet7nzhbxto7l3">
         <w:r>
           <w:rPr>
             <w:rStyle w:val="Hyperlink"/>
@@ -2114,7 +2321,7 @@
       <w:r>
         <w:t xml:space="preserve"> </w:t>
       </w:r>
-      <w:hyperlink w:history="1" r:id="rIdd0dtvbpxf4fzjw_ex3l4o">
+      <w:hyperlink w:history="1" r:id="rIdtraycwsfq_5tmvfgofvqk">
         <w:r>
           <w:rPr>
             <w:rStyle w:val="Hyperlink"/>
@@ -2145,7 +2352,7 @@
       <w:r>
         <w:t xml:space="preserve"> </w:t>
       </w:r>
-      <w:hyperlink w:history="1" r:id="rIdvd-ittvq15irn7xjergxr">
+      <w:hyperlink w:history="1" r:id="rIdjorg8b_fed25viodkq3ea">
         <w:r>
           <w:rPr>
             <w:rStyle w:val="Hyperlink"/>
@@ -2176,7 +2383,7 @@
       <w:r>
         <w:t xml:space="preserve"> </w:t>
       </w:r>
-      <w:hyperlink w:history="1" r:id="rIdgonpmqmnjlhm68m_sziee">
+      <w:hyperlink w:history="1" r:id="rIdbi76jn3rivbjziosgswhk">
         <w:r>
           <w:rPr>
             <w:rStyle w:val="Hyperlink"/>
@@ -2207,7 +2414,7 @@
       <w:r>
         <w:t xml:space="preserve"> </w:t>
       </w:r>
-      <w:hyperlink w:history="1" r:id="rId7pnnovhd9x_8afgz_vzms">
+      <w:hyperlink w:history="1" r:id="rIdmpo_z1vf8m0u453qlzw8t">
         <w:r>
           <w:rPr>
             <w:rStyle w:val="Hyperlink"/>
@@ -2238,7 +2445,7 @@
       <w:r>
         <w:t xml:space="preserve"> </w:t>
       </w:r>
-      <w:hyperlink w:history="1" r:id="rIdes-qhf67uuheykppbwcte">
+      <w:hyperlink w:history="1" r:id="rIdkinpmkpwkvjjtmltqloxm">
         <w:r>
           <w:rPr>
             <w:rStyle w:val="Hyperlink"/>
@@ -2269,7 +2476,7 @@
       <w:r>
         <w:t xml:space="preserve"> </w:t>
       </w:r>
-      <w:hyperlink w:history="1" r:id="rId_7fm1l6o4njznxjkelyre">
+      <w:hyperlink w:history="1" r:id="rId86fwrb74zd-qqidysmij-">
         <w:r>
           <w:rPr>
             <w:rStyle w:val="Hyperlink"/>
@@ -2300,7 +2507,7 @@
       <w:r>
         <w:t xml:space="preserve"> </w:t>
       </w:r>
-      <w:hyperlink w:history="1" r:id="rId0rdvlnww9ker6fv2wycts">
+      <w:hyperlink w:history="1" r:id="rIdrc1vd0pkqz9yb3jujsixk">
         <w:r>
           <w:rPr>
             <w:rStyle w:val="Hyperlink"/>
@@ -2331,7 +2538,7 @@
       <w:r>
         <w:t xml:space="preserve"> </w:t>
       </w:r>
-      <w:hyperlink w:history="1" r:id="rIdx9hhemzw7r6dzeswny-tb">
+      <w:hyperlink w:history="1" r:id="rIdw5khvj8w6uh9odyjo3i0m">
         <w:r>
           <w:rPr>
             <w:rStyle w:val="Hyperlink"/>
@@ -2362,7 +2569,7 @@
       <w:r>
         <w:t xml:space="preserve"> </w:t>
       </w:r>
-      <w:hyperlink w:history="1" r:id="rId6ekwovbpxwacc2x0qnkwr">
+      <w:hyperlink w:history="1" r:id="rIdf1ax_2nieqdrmlmuu_63n">
         <w:r>
           <w:rPr>
             <w:rStyle w:val="Hyperlink"/>
@@ -2393,7 +2600,7 @@
       <w:r>
         <w:t xml:space="preserve"> </w:t>
       </w:r>
-      <w:hyperlink w:history="1" r:id="rIdcujsd_wwcfelc9ieusk-a">
+      <w:hyperlink w:history="1" r:id="rIdf1flky55tgv71uhbl-xb0">
         <w:r>
           <w:rPr>
             <w:rStyle w:val="Hyperlink"/>
@@ -2424,7 +2631,7 @@
       <w:r>
         <w:t xml:space="preserve"> </w:t>
       </w:r>
-      <w:hyperlink w:history="1" r:id="rId8jxjh0e9g3yp3ysl2wgi3">
+      <w:hyperlink w:history="1" r:id="rId9jzdsyhehedtvqb-2k2x2">
         <w:r>
           <w:rPr>
             <w:rStyle w:val="Hyperlink"/>
@@ -2468,7 +2675,7 @@
       <w:r>
         <w:t xml:space="preserve"> </w:t>
       </w:r>
-      <w:hyperlink w:history="1" r:id="rIdag1yeh2mklmoujrcbzrvs">
+      <w:hyperlink w:history="1" r:id="rId6018k3qllfzwe-i5mjlut">
         <w:r>
           <w:rPr>
             <w:rStyle w:val="Hyperlink"/>
@@ -2499,7 +2706,7 @@
       <w:r>
         <w:t xml:space="preserve"> </w:t>
       </w:r>
-      <w:hyperlink w:history="1" r:id="rIdf13n20educ-gsiosxrsly">
+      <w:hyperlink w:history="1" r:id="rId6csqpvm1a8oa12rkotnkp">
         <w:r>
           <w:rPr>
             <w:rStyle w:val="Hyperlink"/>
@@ -2729,6 +2936,18 @@
     <w:lvl w:ilvl="0" w15:tentative="1">
       <w:start w:val="1"/>
       <w:numFmt w:val="decimal"/>
+      <w:lvlText w:val="%1."/>
+      <w:lvlJc w:val="left"/>
+      <w:pPr>
+        <w:ind w:left="567" w:hanging="283"/>
+      </w:pPr>
+    </w:lvl>
+  </w:abstractNum>
+  <w:abstractNum w:abstractNumId="4" w15:restartNumberingAfterBreak="0">
+    <w:multiLevelType w:val="hybridMultilevel"/>
+    <w:lvl w:ilvl="0" w15:tentative="1">
+      <w:start w:val="1"/>
+      <w:numFmt w:val="decimal"/>
       <w:lvlText w:val="QR%1."/>
       <w:lvlJc w:val="left"/>
       <w:pPr>
@@ -2743,12 +2962,18 @@
     </w:lvlOverride>
   </w:num>
   <w:num w:numId="2">
+    <w:abstractNumId w:val="4"/>
+    <w:lvlOverride w:ilvl="0">
+      <w:startOverride w:val="1"/>
+    </w:lvlOverride>
+  </w:num>
+  <w:num w:numId="3">
     <w:abstractNumId w:val="3"/>
     <w:lvlOverride w:ilvl="0">
       <w:startOverride w:val="1"/>
     </w:lvlOverride>
   </w:num>
-  <w:num w:numId="3">
+  <w:num w:numId="4">
     <w:abstractNumId w:val="2"/>
     <w:lvlOverride w:ilvl="0">
       <w:startOverride w:val="1"/>

</xml_diff>

<commit_message>
Projet de recherche : date de dépôt
Co-Authored-By: Claude Opus 5.5 <noreply@anthropic.com>
Claude-Session: https://claude.ai/code/session_014nDgLta1jkqmWhdFtwnAQa
</commit_message>
<xml_diff>
--- a/memoire/Projet_de_recherche_Jalon2.docx
+++ b/memoire/Projet_de_recherche_Jalon2.docx
@@ -149,7 +149,7 @@
         <w:t xml:space="preserve">Date de dépôt : </w:t>
       </w:r>
       <w:r>
-        <w:t xml:space="preserve">[jj/mm/2026]</w:t>
+        <w:t xml:space="preserve">25/10/2026</w:t>
       </w:r>
     </w:p>
     <w:p>
@@ -2166,7 +2166,7 @@
       <w:r>
         <w:t xml:space="preserve"> </w:t>
       </w:r>
-      <w:hyperlink w:history="1" r:id="rIdv0ai7iouo0-goj-arqewu">
+      <w:hyperlink w:history="1" r:id="rIde3s-hcasmcbbbrlhaocwn">
         <w:r>
           <w:rPr>
             <w:rStyle w:val="Hyperlink"/>
@@ -2197,7 +2197,7 @@
       <w:r>
         <w:t xml:space="preserve"> </w:t>
       </w:r>
-      <w:hyperlink w:history="1" r:id="rIdceycmwyebdxbs0uveuxkq">
+      <w:hyperlink w:history="1" r:id="rId8fwu9oedwfpba8why49ys">
         <w:r>
           <w:rPr>
             <w:rStyle w:val="Hyperlink"/>
@@ -2228,7 +2228,7 @@
       <w:r>
         <w:t xml:space="preserve"> </w:t>
       </w:r>
-      <w:hyperlink w:history="1" r:id="rIdenjlnjnlczo9uv4btltpu">
+      <w:hyperlink w:history="1" r:id="rIdbpliazmwwle8e6wnpfsit">
         <w:r>
           <w:rPr>
             <w:rStyle w:val="Hyperlink"/>
@@ -2259,7 +2259,7 @@
       <w:r>
         <w:t xml:space="preserve"> </w:t>
       </w:r>
-      <w:hyperlink w:history="1" r:id="rIdbicpxsravaw7ttqpk6iww">
+      <w:hyperlink w:history="1" r:id="rIddm_orae_9lltze3q9hpgy">
         <w:r>
           <w:rPr>
             <w:rStyle w:val="Hyperlink"/>
@@ -2290,7 +2290,7 @@
       <w:r>
         <w:t xml:space="preserve"> </w:t>
       </w:r>
-      <w:hyperlink w:history="1" r:id="rIdtqhfv65eet7nzhbxto7l3">
+      <w:hyperlink w:history="1" r:id="rIdd-ytvaa6jtxep-qqztghz">
         <w:r>
           <w:rPr>
             <w:rStyle w:val="Hyperlink"/>
@@ -2321,7 +2321,7 @@
       <w:r>
         <w:t xml:space="preserve"> </w:t>
       </w:r>
-      <w:hyperlink w:history="1" r:id="rIdtraycwsfq_5tmvfgofvqk">
+      <w:hyperlink w:history="1" r:id="rIdto4siymg4y_1yzbqvdpdy">
         <w:r>
           <w:rPr>
             <w:rStyle w:val="Hyperlink"/>
@@ -2352,7 +2352,7 @@
       <w:r>
         <w:t xml:space="preserve"> </w:t>
       </w:r>
-      <w:hyperlink w:history="1" r:id="rIdjorg8b_fed25viodkq3ea">
+      <w:hyperlink w:history="1" r:id="rIdhjfrw5eykzhd05n0weiuz">
         <w:r>
           <w:rPr>
             <w:rStyle w:val="Hyperlink"/>
@@ -2383,7 +2383,7 @@
       <w:r>
         <w:t xml:space="preserve"> </w:t>
       </w:r>
-      <w:hyperlink w:history="1" r:id="rIdbi76jn3rivbjziosgswhk">
+      <w:hyperlink w:history="1" r:id="rIdz7dro3bpef7ql-js98vpp">
         <w:r>
           <w:rPr>
             <w:rStyle w:val="Hyperlink"/>
@@ -2414,7 +2414,7 @@
       <w:r>
         <w:t xml:space="preserve"> </w:t>
       </w:r>
-      <w:hyperlink w:history="1" r:id="rIdmpo_z1vf8m0u453qlzw8t">
+      <w:hyperlink w:history="1" r:id="rIdj_jgg25cqkvp6a54j6bgc">
         <w:r>
           <w:rPr>
             <w:rStyle w:val="Hyperlink"/>
@@ -2445,7 +2445,7 @@
       <w:r>
         <w:t xml:space="preserve"> </w:t>
       </w:r>
-      <w:hyperlink w:history="1" r:id="rIdkinpmkpwkvjjtmltqloxm">
+      <w:hyperlink w:history="1" r:id="rIdsbfx3tqckqzpgmamg1vcc">
         <w:r>
           <w:rPr>
             <w:rStyle w:val="Hyperlink"/>
@@ -2476,7 +2476,7 @@
       <w:r>
         <w:t xml:space="preserve"> </w:t>
       </w:r>
-      <w:hyperlink w:history="1" r:id="rId86fwrb74zd-qqidysmij-">
+      <w:hyperlink w:history="1" r:id="rIdfn10k5qf0yn-tdpfpvovw">
         <w:r>
           <w:rPr>
             <w:rStyle w:val="Hyperlink"/>
@@ -2507,7 +2507,7 @@
       <w:r>
         <w:t xml:space="preserve"> </w:t>
       </w:r>
-      <w:hyperlink w:history="1" r:id="rIdrc1vd0pkqz9yb3jujsixk">
+      <w:hyperlink w:history="1" r:id="rIdkdxt8zfdhfegkcsmbcppi">
         <w:r>
           <w:rPr>
             <w:rStyle w:val="Hyperlink"/>
@@ -2538,7 +2538,7 @@
       <w:r>
         <w:t xml:space="preserve"> </w:t>
       </w:r>
-      <w:hyperlink w:history="1" r:id="rIdw5khvj8w6uh9odyjo3i0m">
+      <w:hyperlink w:history="1" r:id="rIdrjbg_a3pc7h2qmdsuqwdv">
         <w:r>
           <w:rPr>
             <w:rStyle w:val="Hyperlink"/>
@@ -2569,7 +2569,7 @@
       <w:r>
         <w:t xml:space="preserve"> </w:t>
       </w:r>
-      <w:hyperlink w:history="1" r:id="rIdf1ax_2nieqdrmlmuu_63n">
+      <w:hyperlink w:history="1" r:id="rIdvw_xrklpimc8zpfu4wvmu">
         <w:r>
           <w:rPr>
             <w:rStyle w:val="Hyperlink"/>
@@ -2600,7 +2600,7 @@
       <w:r>
         <w:t xml:space="preserve"> </w:t>
       </w:r>
-      <w:hyperlink w:history="1" r:id="rIdf1flky55tgv71uhbl-xb0">
+      <w:hyperlink w:history="1" r:id="rIddortmep5dyivrf6kbi80m">
         <w:r>
           <w:rPr>
             <w:rStyle w:val="Hyperlink"/>
@@ -2631,7 +2631,7 @@
       <w:r>
         <w:t xml:space="preserve"> </w:t>
       </w:r>
-      <w:hyperlink w:history="1" r:id="rId9jzdsyhehedtvqb-2k2x2">
+      <w:hyperlink w:history="1" r:id="rIdkfkz55wsfa5hpehrneqer">
         <w:r>
           <w:rPr>
             <w:rStyle w:val="Hyperlink"/>
@@ -2675,7 +2675,7 @@
       <w:r>
         <w:t xml:space="preserve"> </w:t>
       </w:r>
-      <w:hyperlink w:history="1" r:id="rId6018k3qllfzwe-i5mjlut">
+      <w:hyperlink w:history="1" r:id="rIdexzapjuqkzttsa1vlhrwn">
         <w:r>
           <w:rPr>
             <w:rStyle w:val="Hyperlink"/>
@@ -2706,7 +2706,7 @@
       <w:r>
         <w:t xml:space="preserve"> </w:t>
       </w:r>
-      <w:hyperlink w:history="1" r:id="rId6csqpvm1a8oa12rkotnkp">
+      <w:hyperlink w:history="1" r:id="rIdlw6lam0wjanuxl3wp53md">
         <w:r>
           <w:rPr>
             <w:rStyle w:val="Hyperlink"/>

</xml_diff>

<commit_message>
Projet de recherche : lien en accès libre pour Zervas et al. (2017)
Co-Authored-By: Claude Opus 5.5 <noreply@anthropic.com>
Claude-Session: https://claude.ai/code/session_014nDgLta1jkqmWhdFtwnAQa
</commit_message>
<xml_diff>
--- a/memoire/Projet_de_recherche_Jalon2.docx
+++ b/memoire/Projet_de_recherche_Jalon2.docx
@@ -2166,7 +2166,7 @@
       <w:r>
         <w:t xml:space="preserve"> </w:t>
       </w:r>
-      <w:hyperlink w:history="1" r:id="rIde3s-hcasmcbbbrlhaocwn">
+      <w:hyperlink w:history="1" r:id="rIdisaqfhwr6p4b0utppj2om">
         <w:r>
           <w:rPr>
             <w:rStyle w:val="Hyperlink"/>
@@ -2197,7 +2197,7 @@
       <w:r>
         <w:t xml:space="preserve"> </w:t>
       </w:r>
-      <w:hyperlink w:history="1" r:id="rId8fwu9oedwfpba8why49ys">
+      <w:hyperlink w:history="1" r:id="rIdbiusgp40uwxi8beyrpebr">
         <w:r>
           <w:rPr>
             <w:rStyle w:val="Hyperlink"/>
@@ -2228,7 +2228,7 @@
       <w:r>
         <w:t xml:space="preserve"> </w:t>
       </w:r>
-      <w:hyperlink w:history="1" r:id="rIdbpliazmwwle8e6wnpfsit">
+      <w:hyperlink w:history="1" r:id="rIdvbquumiuw3u6oq9g59086">
         <w:r>
           <w:rPr>
             <w:rStyle w:val="Hyperlink"/>
@@ -2259,7 +2259,7 @@
       <w:r>
         <w:t xml:space="preserve"> </w:t>
       </w:r>
-      <w:hyperlink w:history="1" r:id="rIddm_orae_9lltze3q9hpgy">
+      <w:hyperlink w:history="1" r:id="rIdkr4ziqj4uosge5lro7a_u">
         <w:r>
           <w:rPr>
             <w:rStyle w:val="Hyperlink"/>
@@ -2290,7 +2290,7 @@
       <w:r>
         <w:t xml:space="preserve"> </w:t>
       </w:r>
-      <w:hyperlink w:history="1" r:id="rIdd-ytvaa6jtxep-qqztghz">
+      <w:hyperlink w:history="1" r:id="rIdiponrbywtzwj94sg7jkbh">
         <w:r>
           <w:rPr>
             <w:rStyle w:val="Hyperlink"/>
@@ -2321,7 +2321,7 @@
       <w:r>
         <w:t xml:space="preserve"> </w:t>
       </w:r>
-      <w:hyperlink w:history="1" r:id="rIdto4siymg4y_1yzbqvdpdy">
+      <w:hyperlink w:history="1" r:id="rIdo17y2vcajvofnxxcfhyry">
         <w:r>
           <w:rPr>
             <w:rStyle w:val="Hyperlink"/>
@@ -2352,7 +2352,7 @@
       <w:r>
         <w:t xml:space="preserve"> </w:t>
       </w:r>
-      <w:hyperlink w:history="1" r:id="rIdhjfrw5eykzhd05n0weiuz">
+      <w:hyperlink w:history="1" r:id="rId5ebsqqk7vax2seraxdpaj">
         <w:r>
           <w:rPr>
             <w:rStyle w:val="Hyperlink"/>
@@ -2383,7 +2383,7 @@
       <w:r>
         <w:t xml:space="preserve"> </w:t>
       </w:r>
-      <w:hyperlink w:history="1" r:id="rIdz7dro3bpef7ql-js98vpp">
+      <w:hyperlink w:history="1" r:id="rIdvqpshsuk60tn8ugf6jmuu">
         <w:r>
           <w:rPr>
             <w:rStyle w:val="Hyperlink"/>
@@ -2414,7 +2414,7 @@
       <w:r>
         <w:t xml:space="preserve"> </w:t>
       </w:r>
-      <w:hyperlink w:history="1" r:id="rIdj_jgg25cqkvp6a54j6bgc">
+      <w:hyperlink w:history="1" r:id="rIdcb9c1ecb7vegc_cqbrg78">
         <w:r>
           <w:rPr>
             <w:rStyle w:val="Hyperlink"/>
@@ -2445,7 +2445,7 @@
       <w:r>
         <w:t xml:space="preserve"> </w:t>
       </w:r>
-      <w:hyperlink w:history="1" r:id="rIdsbfx3tqckqzpgmamg1vcc">
+      <w:hyperlink w:history="1" r:id="rIdpaitlzy2kkeoac3vwtpzo">
         <w:r>
           <w:rPr>
             <w:rStyle w:val="Hyperlink"/>
@@ -2476,7 +2476,7 @@
       <w:r>
         <w:t xml:space="preserve"> </w:t>
       </w:r>
-      <w:hyperlink w:history="1" r:id="rIdfn10k5qf0yn-tdpfpvovw">
+      <w:hyperlink w:history="1" r:id="rId6vq2524jxvlghfz-hucjv">
         <w:r>
           <w:rPr>
             <w:rStyle w:val="Hyperlink"/>
@@ -2507,7 +2507,7 @@
       <w:r>
         <w:t xml:space="preserve"> </w:t>
       </w:r>
-      <w:hyperlink w:history="1" r:id="rIdkdxt8zfdhfegkcsmbcppi">
+      <w:hyperlink w:history="1" r:id="rIdhd9fnog9nbdng3r1dub2z">
         <w:r>
           <w:rPr>
             <w:rStyle w:val="Hyperlink"/>
@@ -2538,7 +2538,7 @@
       <w:r>
         <w:t xml:space="preserve"> </w:t>
       </w:r>
-      <w:hyperlink w:history="1" r:id="rIdrjbg_a3pc7h2qmdsuqwdv">
+      <w:hyperlink w:history="1" r:id="rIdquh6ibug9lyqynfajtsvs">
         <w:r>
           <w:rPr>
             <w:rStyle w:val="Hyperlink"/>
@@ -2569,7 +2569,7 @@
       <w:r>
         <w:t xml:space="preserve"> </w:t>
       </w:r>
-      <w:hyperlink w:history="1" r:id="rIdvw_xrklpimc8zpfu4wvmu">
+      <w:hyperlink w:history="1" r:id="rIdckrl8or_zqjpvwk9avdwn">
         <w:r>
           <w:rPr>
             <w:rStyle w:val="Hyperlink"/>
@@ -2600,12 +2600,12 @@
       <w:r>
         <w:t xml:space="preserve"> </w:t>
       </w:r>
-      <w:hyperlink w:history="1" r:id="rIddortmep5dyivrf6kbi80m">
+      <w:hyperlink w:history="1" r:id="rIdz_dgdcfqv0atdmrbqz2rr">
         <w:r>
           <w:rPr>
             <w:rStyle w:val="Hyperlink"/>
           </w:rPr>
-          <w:t xml:space="preserve">https://doi.org/10.1509/jmr.15.0204</w:t>
+          <w:t xml:space="preserve">https://open.bu.edu/handle/2144/40311</w:t>
         </w:r>
       </w:hyperlink>
     </w:p>
@@ -2631,7 +2631,7 @@
       <w:r>
         <w:t xml:space="preserve"> </w:t>
       </w:r>
-      <w:hyperlink w:history="1" r:id="rIdkfkz55wsfa5hpehrneqer">
+      <w:hyperlink w:history="1" r:id="rId-jlibim89bg85qq-c6vds">
         <w:r>
           <w:rPr>
             <w:rStyle w:val="Hyperlink"/>
@@ -2675,7 +2675,7 @@
       <w:r>
         <w:t xml:space="preserve"> </w:t>
       </w:r>
-      <w:hyperlink w:history="1" r:id="rIdexzapjuqkzttsa1vlhrwn">
+      <w:hyperlink w:history="1" r:id="rIdz0rdis1ai3xbjw1fbytv6">
         <w:r>
           <w:rPr>
             <w:rStyle w:val="Hyperlink"/>
@@ -2706,7 +2706,7 @@
       <w:r>
         <w:t xml:space="preserve"> </w:t>
       </w:r>
-      <w:hyperlink w:history="1" r:id="rIdlw6lam0wjanuxl3wp53md">
+      <w:hyperlink w:history="1" r:id="rIdx9pkqxr7yrohk6fsstgk3">
         <w:r>
           <w:rPr>
             <w:rStyle w:val="Hyperlink"/>

</xml_diff>

<commit_message>
Projet de recherche : lien PDF direct pour Zervas et al. (2017)
Co-Authored-By: Claude Opus 5.5 <noreply@anthropic.com>
Claude-Session: https://claude.ai/code/session_014nDgLta1jkqmWhdFtwnAQa
</commit_message>
<xml_diff>
--- a/memoire/Projet_de_recherche_Jalon2.docx
+++ b/memoire/Projet_de_recherche_Jalon2.docx
@@ -2166,7 +2166,7 @@
       <w:r>
         <w:t xml:space="preserve"> </w:t>
       </w:r>
-      <w:hyperlink w:history="1" r:id="rIdisaqfhwr6p4b0utppj2om">
+      <w:hyperlink w:history="1" r:id="rIddebwhbwaxcjyfczg1ckj5">
         <w:r>
           <w:rPr>
             <w:rStyle w:val="Hyperlink"/>
@@ -2197,7 +2197,7 @@
       <w:r>
         <w:t xml:space="preserve"> </w:t>
       </w:r>
-      <w:hyperlink w:history="1" r:id="rIdbiusgp40uwxi8beyrpebr">
+      <w:hyperlink w:history="1" r:id="rId7mgoh9iwcwp8feltctazx">
         <w:r>
           <w:rPr>
             <w:rStyle w:val="Hyperlink"/>
@@ -2228,7 +2228,7 @@
       <w:r>
         <w:t xml:space="preserve"> </w:t>
       </w:r>
-      <w:hyperlink w:history="1" r:id="rIdvbquumiuw3u6oq9g59086">
+      <w:hyperlink w:history="1" r:id="rIdhjblg3idpm6biowhrkpnh">
         <w:r>
           <w:rPr>
             <w:rStyle w:val="Hyperlink"/>
@@ -2259,7 +2259,7 @@
       <w:r>
         <w:t xml:space="preserve"> </w:t>
       </w:r>
-      <w:hyperlink w:history="1" r:id="rIdkr4ziqj4uosge5lro7a_u">
+      <w:hyperlink w:history="1" r:id="rId-2hilcmvocbltplkwkjcq">
         <w:r>
           <w:rPr>
             <w:rStyle w:val="Hyperlink"/>
@@ -2290,7 +2290,7 @@
       <w:r>
         <w:t xml:space="preserve"> </w:t>
       </w:r>
-      <w:hyperlink w:history="1" r:id="rIdiponrbywtzwj94sg7jkbh">
+      <w:hyperlink w:history="1" r:id="rIddhtbw2-zr4yefhgbvmke4">
         <w:r>
           <w:rPr>
             <w:rStyle w:val="Hyperlink"/>
@@ -2321,7 +2321,7 @@
       <w:r>
         <w:t xml:space="preserve"> </w:t>
       </w:r>
-      <w:hyperlink w:history="1" r:id="rIdo17y2vcajvofnxxcfhyry">
+      <w:hyperlink w:history="1" r:id="rIdl0cwalerfa5gig7v5ebuo">
         <w:r>
           <w:rPr>
             <w:rStyle w:val="Hyperlink"/>
@@ -2352,7 +2352,7 @@
       <w:r>
         <w:t xml:space="preserve"> </w:t>
       </w:r>
-      <w:hyperlink w:history="1" r:id="rId5ebsqqk7vax2seraxdpaj">
+      <w:hyperlink w:history="1" r:id="rIdzvyxwhkxsma3iebyt6cie">
         <w:r>
           <w:rPr>
             <w:rStyle w:val="Hyperlink"/>
@@ -2383,7 +2383,7 @@
       <w:r>
         <w:t xml:space="preserve"> </w:t>
       </w:r>
-      <w:hyperlink w:history="1" r:id="rIdvqpshsuk60tn8ugf6jmuu">
+      <w:hyperlink w:history="1" r:id="rId7aklpkrvwo5geoxq5efie">
         <w:r>
           <w:rPr>
             <w:rStyle w:val="Hyperlink"/>
@@ -2414,7 +2414,7 @@
       <w:r>
         <w:t xml:space="preserve"> </w:t>
       </w:r>
-      <w:hyperlink w:history="1" r:id="rIdcb9c1ecb7vegc_cqbrg78">
+      <w:hyperlink w:history="1" r:id="rIdj3wbent0_xdpcqxcpkfmc">
         <w:r>
           <w:rPr>
             <w:rStyle w:val="Hyperlink"/>
@@ -2445,7 +2445,7 @@
       <w:r>
         <w:t xml:space="preserve"> </w:t>
       </w:r>
-      <w:hyperlink w:history="1" r:id="rIdpaitlzy2kkeoac3vwtpzo">
+      <w:hyperlink w:history="1" r:id="rIdid_e1nytqcokplghce-oo">
         <w:r>
           <w:rPr>
             <w:rStyle w:val="Hyperlink"/>
@@ -2476,7 +2476,7 @@
       <w:r>
         <w:t xml:space="preserve"> </w:t>
       </w:r>
-      <w:hyperlink w:history="1" r:id="rId6vq2524jxvlghfz-hucjv">
+      <w:hyperlink w:history="1" r:id="rId3zopfbew86v-_bftvmbn2">
         <w:r>
           <w:rPr>
             <w:rStyle w:val="Hyperlink"/>
@@ -2507,7 +2507,7 @@
       <w:r>
         <w:t xml:space="preserve"> </w:t>
       </w:r>
-      <w:hyperlink w:history="1" r:id="rIdhd9fnog9nbdng3r1dub2z">
+      <w:hyperlink w:history="1" r:id="rIdvcmljt6w9w9630xncaktv">
         <w:r>
           <w:rPr>
             <w:rStyle w:val="Hyperlink"/>
@@ -2538,7 +2538,7 @@
       <w:r>
         <w:t xml:space="preserve"> </w:t>
       </w:r>
-      <w:hyperlink w:history="1" r:id="rIdquh6ibug9lyqynfajtsvs">
+      <w:hyperlink w:history="1" r:id="rIdeb9qysce_hwqxpx5mhjhh">
         <w:r>
           <w:rPr>
             <w:rStyle w:val="Hyperlink"/>
@@ -2569,7 +2569,7 @@
       <w:r>
         <w:t xml:space="preserve"> </w:t>
       </w:r>
-      <w:hyperlink w:history="1" r:id="rIdckrl8or_zqjpvwk9avdwn">
+      <w:hyperlink w:history="1" r:id="rIdvj_j2thkxobdlei7edz0m">
         <w:r>
           <w:rPr>
             <w:rStyle w:val="Hyperlink"/>
@@ -2600,12 +2600,12 @@
       <w:r>
         <w:t xml:space="preserve"> </w:t>
       </w:r>
-      <w:hyperlink w:history="1" r:id="rIdz_dgdcfqv0atdmrbqz2rr">
+      <w:hyperlink w:history="1" r:id="rIdpge7x6gf0zvsg3anl02z-">
         <w:r>
           <w:rPr>
             <w:rStyle w:val="Hyperlink"/>
           </w:rPr>
-          <w:t xml:space="preserve">https://open.bu.edu/handle/2144/40311</w:t>
+          <w:t xml:space="preserve">https://people.bu.edu/zg/publications/airbnb.pdf</w:t>
         </w:r>
       </w:hyperlink>
     </w:p>
@@ -2631,7 +2631,7 @@
       <w:r>
         <w:t xml:space="preserve"> </w:t>
       </w:r>
-      <w:hyperlink w:history="1" r:id="rId-jlibim89bg85qq-c6vds">
+      <w:hyperlink w:history="1" r:id="rIdpdt5k3hpn086a31pq4lf8">
         <w:r>
           <w:rPr>
             <w:rStyle w:val="Hyperlink"/>
@@ -2675,7 +2675,7 @@
       <w:r>
         <w:t xml:space="preserve"> </w:t>
       </w:r>
-      <w:hyperlink w:history="1" r:id="rIdz0rdis1ai3xbjw1fbytv6">
+      <w:hyperlink w:history="1" r:id="rIdhmmsqe8vajyhuzhe3-lsj">
         <w:r>
           <w:rPr>
             <w:rStyle w:val="Hyperlink"/>
@@ -2706,7 +2706,7 @@
       <w:r>
         <w:t xml:space="preserve"> </w:t>
       </w:r>
-      <w:hyperlink w:history="1" r:id="rIdx9pkqxr7yrohk6fsstgk3">
+      <w:hyperlink w:history="1" r:id="rIdawjlamxf6rdxu81jzijgz">
         <w:r>
           <w:rPr>
             <w:rStyle w:val="Hyperlink"/>

</xml_diff>

<commit_message>
Projet de recherche : intégration des reformulations des auteurs
Co-Authored-By: Claude Opus 5.5 <noreply@anthropic.com>
Claude-Session: https://claude.ai/code/session_014nDgLta1jkqmWhdFtwnAQa
</commit_message>
<xml_diff>
--- a/memoire/Projet_de_recherche_Jalon2.docx
+++ b/memoire/Projet_de_recherche_Jalon2.docx
@@ -166,7 +166,7 @@
         <w:jc w:val="both"/>
       </w:pPr>
       <w:r>
-        <w:t xml:space="preserve">En moins de deux décennies, la location touristique de courte durée est passée du statut de pratique marginale à celui de composante structurelle de l’économie urbaine européenne. Portées par des plateformes comme Airbnb, des centaines de milliers de logements ont basculé du marché résidentiel vers le marché touristique, au point de transformer en profondeur certains quartiers centraux. Longtemps présenté comme une forme d’« économie du partage » (Guttentag, 2015), ce modèle s’est rapidement professionnalisé : une part croissante de l’offre est aujourd’hui détenue par des multi-propriétaires et gérée par des conciergeries spécialisées.</w:t>
+        <w:t xml:space="preserve">En moins de deux décennies, la location touristique de courte durée est passée du statut de pratique marginale à celui de composante structurelle de l’économie urbaine européenne. Portées par des plateformes comme Airbnb, des centaines de milliers de logements sont passés du marché résidentiel au marché touristique, jusqu’à transformer en profondeur certains quartiers centraux. Présentée au départ comme une « économie du partage » (Guttentag, 2015), la location de courte durée s’est vite professionnalisée : une part croissante de l’offre est désormais détenue par des multi-propriétaires et gérée par des conciergeries spécialisées.</w:t>
       </w:r>
     </w:p>
     <w:p>
@@ -175,7 +175,7 @@
         <w:jc w:val="both"/>
       </w:pPr>
       <w:r>
-        <w:t xml:space="preserve">Cette expansion a nourri de vives tensions avec les populations locales. La littérature a documenté ses effets sur le marché du logement : raréfaction de l’offre de location longue durée, hausse des loyers et des prix de l’immobilier (Barron et al., 2021 ; Garcia-López et al., 2020), et dynamiques de gentrification touristique (Wachsmuth &amp; Weisler, 2018). Face à ces externalités, les villes ont progressivement durci leur arsenal réglementaire : plafonds de nuitées, enregistrement obligatoire, autorisations de changement d’usage, voire interdictions ciblées (Gurran &amp; Phibbs, 2017 ; Nieuwland &amp; van Melik, 2020). L’Union européenne a elle-même adopté en 2024 un règlement imposant le partage des données entre plateformes et autorités publiques.</w:t>
+        <w:t xml:space="preserve">Cette expansion a nourri de vives tensions avec les habitants. La littérature a documenté ses effets sur le marché du logement : raréfaction de l’offre de location longue durée, hausse des loyers et des prix de l’immobilier (Barron et al., 2021 ; Garcia-López et al., 2020), et dynamiques de gentrification touristique (Wachsmuth &amp; Weisler, 2018). Face à ces externalités, les villes ont progressivement durci leur arsenal réglementaire : plafonds de nuitées, enregistrement obligatoire, autorisations de changement d’usage, voire interdictions ciblées (Gurran &amp; Phibbs, 2017 ; Nieuwland &amp; van Melik, 2020). L’Union européenne a elle-même adopté en 2024 un règlement imposant le partage des données entre plateformes et autorités publiques.</w:t>
       </w:r>
     </w:p>
     <w:p>
@@ -429,7 +429,7 @@
         <w:t xml:space="preserve">Enjeu académique. </w:t>
       </w:r>
       <w:r>
-        <w:t xml:space="preserve">Le mémoire articule deux champs encore peu connectés : la littérature sur la location touristique, centrée sur ses impacts urbains, et celle sur l’adaptation des business models face aux pressions institutionnelles. Le design comparatif, fondé sur deux intensités de régulation, permet d’interroger le lien entre degré de contrainte et profondeur de l’adaptation.</w:t>
+        <w:t xml:space="preserve">Le mémoire croise deux champs de recherche qui se parlent encore peu : d’un côté, la littérature sur la location touristique et ses effets urbains ; de l’autre, celle sur la manière dont les modèles d’affaires s’adaptent aux pressions institutionnelles. Le design comparatif, fondé sur deux niveaux de régulation, permet d’examiner le lien entre intensité de la contrainte et profondeur de l’adaptation.</w:t>
       </w:r>
     </w:p>
     <w:p>
@@ -450,7 +450,7 @@
         <w:t xml:space="preserve">Enjeu managérial. </w:t>
       </w:r>
       <w:r>
-        <w:t xml:space="preserve">Les résultats doivent fournir aux gestionnaires, conciergeries et investisseurs une grille de lecture des options stratégiques disponibles face à un environnement réglementaire mouvant, ainsi que des enseignements pour les plateformes elles-mêmes.</w:t>
+        <w:t xml:space="preserve">Les résultats doivent fournir aux gestionnaires, conciergeries et investisseurs une grille de lecture des options stratégiques face à un cadre réglementaire mouvant, ainsi que des enseignements pour les plateformes elles-mêmes.</w:t>
       </w:r>
     </w:p>
     <w:p>
@@ -471,7 +471,7 @@
         <w:t xml:space="preserve">Enjeu sociétal (ODD 11). </w:t>
       </w:r>
       <w:r>
-        <w:t xml:space="preserve">Comprendre comment le secteur se recompose éclaire les conditions d’une coexistence soutenable entre économie touristique et droit au logement, et offre aux collectivités un retour sur les effets concrets de leurs politiques.</w:t>
+        <w:t xml:space="preserve">Comprendre comment le secteur se recompose éclaire les conditions d’une cohabitation soutenable entre économie touristique et droit au logement, et offre aux collectivités un retour concret sur les effets de leurs politiques.</w:t>
       </w:r>
     </w:p>
     <w:p>
@@ -646,7 +646,7 @@
         <w:t xml:space="preserve">P2 – </w:t>
       </w:r>
       <w:r>
-        <w:t xml:space="preserve">Les stratégies d’adaptation diffèrent selon le type d’acteur : les conciergeries, dont le modèle repose sur la gestion pour le compte de tiers, tendent à diversifier leur offre (location de moyenne durée, autres services immobiliers), tandis que les multi-propriétaires arbitrent davantage entre mise en conformité, réallocation de leur parc et sortie du marché.</w:t>
+        <w:t xml:space="preserve">Les stratégies d’adaptation varient selon le type d’acteur. Les conciergeries, dont le modèle repose sur la gestion pour le compte de tiers, tendent à diversifier leur offre (location de moyenne durée, autres services immobiliers), tandis que les multi-propriétaires arbitrent plutôt entre mise en conformité, réallocation de leur parc et sortie du marché.</w:t>
       </w:r>
     </w:p>
     <w:p>
@@ -671,17 +671,17 @@
         <w:jc w:val="both"/>
       </w:pPr>
       <w:r>
-        <w:t xml:space="preserve">L’étude adoptera une </w:t>
-      </w:r>
-      <w:r>
-        <w:rPr>
-          <w:b/>
-          <w:bCs/>
-        </w:rPr>
-        <w:t xml:space="preserve">approche qualitative exploratoire</w:t>
-      </w:r>
-      <w:r>
-        <w:t xml:space="preserve">, fondée sur une </w:t>
+        <w:t xml:space="preserve">Le mémoire s’appuie sur une </w:t>
+      </w:r>
+      <w:r>
+        <w:rPr>
+          <w:b/>
+          <w:bCs/>
+        </w:rPr>
+        <w:t xml:space="preserve">démarche qualitative exploratoire</w:t>
+      </w:r>
+      <w:r>
+        <w:t xml:space="preserve">, fondée sur l’</w:t>
       </w:r>
       <w:r>
         <w:rPr>
@@ -691,7 +691,7 @@
         <w:t xml:space="preserve">étude comparée de deux cas</w:t>
       </w:r>
       <w:r>
-        <w:t xml:space="preserve"> (Eisenhardt, 1989) : Barcelone et Marseille. Ce choix se justifie par la nature de la question, qui porte sur des logiques d’acteurs et des processus de décision difficiles à saisir par une approche quantitative.</w:t>
+        <w:t xml:space="preserve">, Barcelone et Marseille (Eisenhardt, 1989). Ce choix tient à la nature de la question : elle porte sur des logiques d’acteurs et des processus de décision, difficiles à saisir par une approche quantitative.</w:t>
       </w:r>
     </w:p>
     <w:p>
@@ -1330,7 +1330,7 @@
         <w:jc w:val="both"/>
       </w:pPr>
       <w:r>
-        <w:t xml:space="preserve">Entretiens barcelonais menés en anglais ou en espagnol selon la préférence du répondant, retranscrits dans la langue d’origine ; les extraits cités seront traduits et le processus de traduction documenté.</w:t>
+        <w:t xml:space="preserve">Entretiens barcelonais menés en anglais ou en espagnol selon la préférence de l’interlocuteur, retranscrits dans leur langue d’origine. Les extraits cités seront traduits, et le processus de traduction documenté.</w:t>
       </w:r>
     </w:p>
     <w:p>
@@ -1351,7 +1351,7 @@
         <w:t xml:space="preserve">Consentement éclairé : </w:t>
       </w:r>
       <w:r>
-        <w:t xml:space="preserve">chaque participant signera un formulaire précisant l’objet de l’étude, l’enregistrement de l’entretien, l’anonymisation des données et son droit de retrait.</w:t>
+        <w:t xml:space="preserve">chaque participant signera un formulaire précisant l’objet de l’étude, l’enregistrement, l’anonymisation des données et son droit de retrait.</w:t>
       </w:r>
     </w:p>
     <w:p>
@@ -1407,7 +1407,14 @@
         <w:jc w:val="both"/>
       </w:pPr>
       <w:r>
-        <w:t xml:space="preserve">Triangulation par des données secondaires : textes réglementaires, rapports annuels et communications d’Airbnb, données publiques sur l’évolution des annonces.</w:t>
+        <w:rPr>
+          <w:b/>
+          <w:bCs/>
+        </w:rPr>
+        <w:t xml:space="preserve">Triangulation : </w:t>
+      </w:r>
+      <w:r>
+        <w:t xml:space="preserve">pour croiser les données d’entretien, le mémoire mobilise des sources secondaires (textes réglementaires, rapports annuels et communications d’Airbnb, données publiques sur l’évolution des annonces).</w:t>
       </w:r>
     </w:p>
     <w:p>
@@ -1461,7 +1468,7 @@
         <w:jc w:val="both"/>
       </w:pPr>
       <w:r>
-        <w:t xml:space="preserve">Les deux auteurs travailleront conjointement sur les deux terrains. Chaque entretien sera, dans la mesure du possible, conduit en binôme : l’un mène l’échange, l’autre prend des notes et relance. Cette organisation garantit une connaissance égale des deux cas par chacun des auteurs, condition d’une analyse comparée rigoureuse. La revue de littérature, le codage et l’interprétation des résultats seront également menés à quatre mains, ce qui permettra de confronter les lectures et de limiter les biais d’interprétation propres à un chercheur isolé. Cette répartition assure une contribution équivalente des deux auteurs.</w:t>
+        <w:t xml:space="preserve">Les deux auteurs travailleront conjointement sur les deux terrains. Dans la mesure du possible, chaque entretien sera mené à deux : l’un conduit l’échange, l’autre prend des notes et relance. Cette organisation assure à chacun des auteurs une connaissance équivalente des deux terrains, condition d’une analyse comparée rigoureuse. La revue de littérature, le codage et l’interprétation des résultats seront également menés à quatre mains, pour confronter les lectures et limiter les biais d’interprétation propres à un chercheur isolé. Cette répartition garantit une contribution équivalente des deux auteurs.</w:t>
       </w:r>
     </w:p>
     <w:p>
@@ -2166,7 +2173,7 @@
       <w:r>
         <w:t xml:space="preserve"> </w:t>
       </w:r>
-      <w:hyperlink w:history="1" r:id="rIddebwhbwaxcjyfczg1ckj5">
+      <w:hyperlink w:history="1" r:id="rIdd3cdl5-clftwtwxspyz_e">
         <w:r>
           <w:rPr>
             <w:rStyle w:val="Hyperlink"/>
@@ -2197,7 +2204,7 @@
       <w:r>
         <w:t xml:space="preserve"> </w:t>
       </w:r>
-      <w:hyperlink w:history="1" r:id="rId7mgoh9iwcwp8feltctazx">
+      <w:hyperlink w:history="1" r:id="rIdnz0ig57l3kuux9u0cmkaa">
         <w:r>
           <w:rPr>
             <w:rStyle w:val="Hyperlink"/>
@@ -2228,7 +2235,7 @@
       <w:r>
         <w:t xml:space="preserve"> </w:t>
       </w:r>
-      <w:hyperlink w:history="1" r:id="rIdhjblg3idpm6biowhrkpnh">
+      <w:hyperlink w:history="1" r:id="rIdr_wzq25yhdf-gdcatunam">
         <w:r>
           <w:rPr>
             <w:rStyle w:val="Hyperlink"/>
@@ -2259,7 +2266,7 @@
       <w:r>
         <w:t xml:space="preserve"> </w:t>
       </w:r>
-      <w:hyperlink w:history="1" r:id="rId-2hilcmvocbltplkwkjcq">
+      <w:hyperlink w:history="1" r:id="rIdcrdfxkkst5m18a_g4iepy">
         <w:r>
           <w:rPr>
             <w:rStyle w:val="Hyperlink"/>
@@ -2290,7 +2297,7 @@
       <w:r>
         <w:t xml:space="preserve"> </w:t>
       </w:r>
-      <w:hyperlink w:history="1" r:id="rIddhtbw2-zr4yefhgbvmke4">
+      <w:hyperlink w:history="1" r:id="rIdneilib-xwjezxw5j8s0l4">
         <w:r>
           <w:rPr>
             <w:rStyle w:val="Hyperlink"/>
@@ -2321,7 +2328,7 @@
       <w:r>
         <w:t xml:space="preserve"> </w:t>
       </w:r>
-      <w:hyperlink w:history="1" r:id="rIdl0cwalerfa5gig7v5ebuo">
+      <w:hyperlink w:history="1" r:id="rIdjcdoudsyrflmx6kjcyb0f">
         <w:r>
           <w:rPr>
             <w:rStyle w:val="Hyperlink"/>
@@ -2352,7 +2359,7 @@
       <w:r>
         <w:t xml:space="preserve"> </w:t>
       </w:r>
-      <w:hyperlink w:history="1" r:id="rIdzvyxwhkxsma3iebyt6cie">
+      <w:hyperlink w:history="1" r:id="rIdxzsvna20gqf1hjwe4hvjd">
         <w:r>
           <w:rPr>
             <w:rStyle w:val="Hyperlink"/>
@@ -2383,7 +2390,7 @@
       <w:r>
         <w:t xml:space="preserve"> </w:t>
       </w:r>
-      <w:hyperlink w:history="1" r:id="rId7aklpkrvwo5geoxq5efie">
+      <w:hyperlink w:history="1" r:id="rIdbyzcmj0dnau4ygvgom9au">
         <w:r>
           <w:rPr>
             <w:rStyle w:val="Hyperlink"/>
@@ -2414,7 +2421,7 @@
       <w:r>
         <w:t xml:space="preserve"> </w:t>
       </w:r>
-      <w:hyperlink w:history="1" r:id="rIdj3wbent0_xdpcqxcpkfmc">
+      <w:hyperlink w:history="1" r:id="rIdpppypi4ovnoxpfdwp-bai">
         <w:r>
           <w:rPr>
             <w:rStyle w:val="Hyperlink"/>
@@ -2445,7 +2452,7 @@
       <w:r>
         <w:t xml:space="preserve"> </w:t>
       </w:r>
-      <w:hyperlink w:history="1" r:id="rIdid_e1nytqcokplghce-oo">
+      <w:hyperlink w:history="1" r:id="rId9si7xjnixdwvxipuz7ty5">
         <w:r>
           <w:rPr>
             <w:rStyle w:val="Hyperlink"/>
@@ -2476,7 +2483,7 @@
       <w:r>
         <w:t xml:space="preserve"> </w:t>
       </w:r>
-      <w:hyperlink w:history="1" r:id="rId3zopfbew86v-_bftvmbn2">
+      <w:hyperlink w:history="1" r:id="rIdy_u4kxyomqn3ey1q617sr">
         <w:r>
           <w:rPr>
             <w:rStyle w:val="Hyperlink"/>
@@ -2507,7 +2514,7 @@
       <w:r>
         <w:t xml:space="preserve"> </w:t>
       </w:r>
-      <w:hyperlink w:history="1" r:id="rIdvcmljt6w9w9630xncaktv">
+      <w:hyperlink w:history="1" r:id="rIddekhoxzw1z_ckjahhcv5b">
         <w:r>
           <w:rPr>
             <w:rStyle w:val="Hyperlink"/>
@@ -2538,7 +2545,7 @@
       <w:r>
         <w:t xml:space="preserve"> </w:t>
       </w:r>
-      <w:hyperlink w:history="1" r:id="rIdeb9qysce_hwqxpx5mhjhh">
+      <w:hyperlink w:history="1" r:id="rIdlfciprguv-snm6fefyprf">
         <w:r>
           <w:rPr>
             <w:rStyle w:val="Hyperlink"/>
@@ -2569,7 +2576,7 @@
       <w:r>
         <w:t xml:space="preserve"> </w:t>
       </w:r>
-      <w:hyperlink w:history="1" r:id="rIdvj_j2thkxobdlei7edz0m">
+      <w:hyperlink w:history="1" r:id="rIdoezmmetjmoj5clwfb385_">
         <w:r>
           <w:rPr>
             <w:rStyle w:val="Hyperlink"/>
@@ -2600,7 +2607,7 @@
       <w:r>
         <w:t xml:space="preserve"> </w:t>
       </w:r>
-      <w:hyperlink w:history="1" r:id="rIdpge7x6gf0zvsg3anl02z-">
+      <w:hyperlink w:history="1" r:id="rIdvhbuknmd7xtt0c3w3p6gs">
         <w:r>
           <w:rPr>
             <w:rStyle w:val="Hyperlink"/>
@@ -2631,7 +2638,7 @@
       <w:r>
         <w:t xml:space="preserve"> </w:t>
       </w:r>
-      <w:hyperlink w:history="1" r:id="rIdpdt5k3hpn086a31pq4lf8">
+      <w:hyperlink w:history="1" r:id="rIdkitr0i9gcmhcqxohmpnax">
         <w:r>
           <w:rPr>
             <w:rStyle w:val="Hyperlink"/>
@@ -2675,7 +2682,7 @@
       <w:r>
         <w:t xml:space="preserve"> </w:t>
       </w:r>
-      <w:hyperlink w:history="1" r:id="rIdhmmsqe8vajyhuzhe3-lsj">
+      <w:hyperlink w:history="1" r:id="rIdd_ejqvq6mo3gnk2mnfdme">
         <w:r>
           <w:rPr>
             <w:rStyle w:val="Hyperlink"/>
@@ -2706,7 +2713,7 @@
       <w:r>
         <w:t xml:space="preserve"> </w:t>
       </w:r>
-      <w:hyperlink w:history="1" r:id="rIdawjlamxf6rdxu81jzijgz">
+      <w:hyperlink w:history="1" r:id="rIdqdwrovrwqacmgbyrfumhh">
         <w:r>
           <w:rPr>
             <w:rStyle w:val="Hyperlink"/>

</xml_diff>